<commit_message>
Rerun after fixing diet flag
</commit_message>
<xml_diff>
--- a/doc/outcomes_table.docx
+++ b/doc/outcomes_table.docx
@@ -412,31 +412,31 @@
                 <w:rFonts w:ascii="Calibri" w:hAnsi="Calibri"/>
                 <w:sz w:val="20"/>
               </w:rPr>
-              <w:t xml:space="default">0.03 (-0.04 to 0.09)</w:t>
-            </w:r>
-          </w:p>
-        </w:tc>
-        <w:tc>
-          <w:tcPr>
-            <w:tcBorders>
-              <w:top w:val="single" w:space="0" w:color="D3D3D3"/>
-              <w:bottom w:val="single" w:space="0" w:color="D3D3D3"/>
-              <w:start w:val="single" w:space="0" w:color="D3D3D3"/>
-              <w:end w:val="single" w:space="0" w:color="D3D3D3"/>
-            </w:tcBorders>
-          </w:tcPr>
-          <w:p>
-            <w:pPr>
-              <w:spacing w:before="0" w:after="60"/>
-              <w:keepNext/>
-              <w:jc w:val="center"/>
-            </w:pPr>
-            <w:r>
-              <w:rPr>
-                <w:rFonts w:ascii="Calibri" w:hAnsi="Calibri"/>
-                <w:sz w:val="20"/>
-              </w:rPr>
-              <w:t xml:space="default">0.41</w:t>
+              <w:t xml:space="default">0.02 (-0.04 to 0.09)</w:t>
+            </w:r>
+          </w:p>
+        </w:tc>
+        <w:tc>
+          <w:tcPr>
+            <w:tcBorders>
+              <w:top w:val="single" w:space="0" w:color="D3D3D3"/>
+              <w:bottom w:val="single" w:space="0" w:color="D3D3D3"/>
+              <w:start w:val="single" w:space="0" w:color="D3D3D3"/>
+              <w:end w:val="single" w:space="0" w:color="D3D3D3"/>
+            </w:tcBorders>
+          </w:tcPr>
+          <w:p>
+            <w:pPr>
+              <w:spacing w:before="0" w:after="60"/>
+              <w:keepNext/>
+              <w:jc w:val="center"/>
+            </w:pPr>
+            <w:r>
+              <w:rPr>
+                <w:rFonts w:ascii="Calibri" w:hAnsi="Calibri"/>
+                <w:sz w:val="20"/>
+              </w:rPr>
+              <w:t xml:space="default">0.46</w:t>
             </w:r>
           </w:p>
         </w:tc>
@@ -484,7 +484,7 @@
                 <w:rFonts w:ascii="Calibri" w:hAnsi="Calibri"/>
                 <w:sz w:val="20"/>
               </w:rPr>
-              <w:t xml:space="default">0.60</w:t>
+              <w:t xml:space="default">0.63</w:t>
             </w:r>
           </w:p>
         </w:tc>
@@ -537,7 +537,7 @@
                 <w:rFonts w:ascii="Calibri" w:hAnsi="Calibri"/>
                 <w:sz w:val="20"/>
               </w:rPr>
-              <w:t xml:space="default">0.25 (0.03 to 0.47)</w:t>
+              <w:t xml:space="default">0.24 (0.02 to 0.46)</w:t>
             </w:r>
           </w:p>
         </w:tc>
@@ -562,31 +562,31 @@
                 <w:sz w:val="20"/>
                 <w:b w:val="true"/>
               </w:rPr>
-              <w:t xml:space="default">0.027</w:t>
-            </w:r>
-          </w:p>
-        </w:tc>
-        <w:tc>
-          <w:tcPr>
-            <w:tcBorders>
-              <w:top w:val="single" w:space="0" w:color="D3D3D3"/>
-              <w:bottom w:val="single" w:space="0" w:color="D3D3D3"/>
-              <w:start w:val="single" w:space="0" w:color="D3D3D3"/>
-              <w:end w:val="single" w:space="0" w:color="D3D3D3"/>
-            </w:tcBorders>
-          </w:tcPr>
-          <w:p>
-            <w:pPr>
-              <w:spacing w:before="0" w:after="60"/>
-              <w:keepNext/>
-              <w:jc w:val="center"/>
-            </w:pPr>
-            <w:r>
-              <w:rPr>
-                <w:rFonts w:ascii="Calibri" w:hAnsi="Calibri"/>
-                <w:sz w:val="20"/>
-              </w:rPr>
-              <w:t xml:space="default">0.28 (-0.06 to 0.63)</w:t>
+              <w:t xml:space="default">0.032</w:t>
+            </w:r>
+          </w:p>
+        </w:tc>
+        <w:tc>
+          <w:tcPr>
+            <w:tcBorders>
+              <w:top w:val="single" w:space="0" w:color="D3D3D3"/>
+              <w:bottom w:val="single" w:space="0" w:color="D3D3D3"/>
+              <w:start w:val="single" w:space="0" w:color="D3D3D3"/>
+              <w:end w:val="single" w:space="0" w:color="D3D3D3"/>
+            </w:tcBorders>
+          </w:tcPr>
+          <w:p>
+            <w:pPr>
+              <w:spacing w:before="0" w:after="60"/>
+              <w:keepNext/>
+              <w:jc w:val="center"/>
+            </w:pPr>
+            <w:r>
+              <w:rPr>
+                <w:rFonts w:ascii="Calibri" w:hAnsi="Calibri"/>
+                <w:sz w:val="20"/>
+              </w:rPr>
+              <w:t xml:space="default">0.28 (-0.07 to 0.63)</w:t>
             </w:r>
           </w:p>
         </w:tc>
@@ -711,7 +711,7 @@
                 <w:rFonts w:ascii="Calibri" w:hAnsi="Calibri"/>
                 <w:sz w:val="20"/>
               </w:rPr>
-              <w:t xml:space="default">-0.10 (-0.15 to -0.05)</w:t>
+              <w:t xml:space="default">-0.10 (-0.15 to -0.06)</w:t>
             </w:r>
           </w:p>
         </w:tc>
@@ -837,31 +837,31 @@
                 <w:rFonts w:ascii="Calibri" w:hAnsi="Calibri"/>
                 <w:sz w:val="20"/>
               </w:rPr>
-              <w:t xml:space="default">-0.01 (-0.06 to 0.04)</w:t>
-            </w:r>
-          </w:p>
-        </w:tc>
-        <w:tc>
-          <w:tcPr>
-            <w:tcBorders>
-              <w:top w:val="single" w:space="0" w:color="D3D3D3"/>
-              <w:bottom w:val="single" w:space="0" w:color="D3D3D3"/>
-              <w:start w:val="single" w:space="0" w:color="D3D3D3"/>
-              <w:end w:val="single" w:space="0" w:color="D3D3D3"/>
-            </w:tcBorders>
-          </w:tcPr>
-          <w:p>
-            <w:pPr>
-              <w:spacing w:before="0" w:after="60"/>
-              <w:keepNext/>
-              <w:jc w:val="center"/>
-            </w:pPr>
-            <w:r>
-              <w:rPr>
-                <w:rFonts w:ascii="Calibri" w:hAnsi="Calibri"/>
-                <w:sz w:val="20"/>
-              </w:rPr>
-              <w:t xml:space="default">0.60</w:t>
+              <w:t xml:space="default">-0.01 (-0.06 to 0.03)</w:t>
+            </w:r>
+          </w:p>
+        </w:tc>
+        <w:tc>
+          <w:tcPr>
+            <w:tcBorders>
+              <w:top w:val="single" w:space="0" w:color="D3D3D3"/>
+              <w:bottom w:val="single" w:space="0" w:color="D3D3D3"/>
+              <w:start w:val="single" w:space="0" w:color="D3D3D3"/>
+              <w:end w:val="single" w:space="0" w:color="D3D3D3"/>
+            </w:tcBorders>
+          </w:tcPr>
+          <w:p>
+            <w:pPr>
+              <w:spacing w:before="0" w:after="60"/>
+              <w:keepNext/>
+              <w:jc w:val="center"/>
+            </w:pPr>
+            <w:r>
+              <w:rPr>
+                <w:rFonts w:ascii="Calibri" w:hAnsi="Calibri"/>
+                <w:sz w:val="20"/>
+              </w:rPr>
+              <w:t xml:space="default">0.55</w:t>
             </w:r>
           </w:p>
         </w:tc>
@@ -1064,7 +1064,7 @@
                 <w:rFonts w:ascii="Calibri" w:hAnsi="Calibri"/>
                 <w:sz w:val="20"/>
               </w:rPr>
-              <w:t xml:space="default">0.97</w:t>
+              <w:t xml:space="default">0.99</w:t>
             </w:r>
           </w:p>
         </w:tc>
@@ -1112,7 +1112,7 @@
                 <w:rFonts w:ascii="Calibri" w:hAnsi="Calibri"/>
                 <w:sz w:val="20"/>
               </w:rPr>
-              <w:t xml:space="default">0.39</w:t>
+              <w:t xml:space="default">0.37</w:t>
             </w:r>
           </w:p>
         </w:tc>
@@ -1189,7 +1189,7 @@
                 <w:rFonts w:ascii="Calibri" w:hAnsi="Calibri"/>
                 <w:sz w:val="20"/>
               </w:rPr>
-              <w:t xml:space="default">0.54</w:t>
+              <w:t xml:space="default">0.55</w:t>
             </w:r>
           </w:p>
         </w:tc>
@@ -1237,7 +1237,7 @@
                 <w:rFonts w:ascii="Calibri" w:hAnsi="Calibri"/>
                 <w:sz w:val="20"/>
               </w:rPr>
-              <w:t xml:space="default">0.85</w:t>
+              <w:t xml:space="default">0.81</w:t>
             </w:r>
           </w:p>
         </w:tc>
@@ -1338,7 +1338,7 @@
                 <w:rFonts w:ascii="Calibri" w:hAnsi="Calibri"/>
                 <w:sz w:val="20"/>
               </w:rPr>
-              <w:t xml:space="default">-0.01 (-0.02 to -0.01)</w:t>
+              <w:t xml:space="default">-0.02 (-0.02 to -0.01)</w:t>
             </w:r>
           </w:p>
         </w:tc>
@@ -1488,7 +1488,7 @@
                 <w:rFonts w:ascii="Calibri" w:hAnsi="Calibri"/>
                 <w:sz w:val="20"/>
               </w:rPr>
-              <w:t xml:space="default">0.23</w:t>
+              <w:t xml:space="default">0.26</w:t>
             </w:r>
           </w:p>
         </w:tc>
@@ -1667,31 +1667,31 @@
                 <w:rFonts w:ascii="Calibri" w:hAnsi="Calibri"/>
                 <w:sz w:val="20"/>
               </w:rPr>
-              <w:t xml:space="default">0.01 (-0.01 to 0.02)</w:t>
-            </w:r>
-          </w:p>
-        </w:tc>
-        <w:tc>
-          <w:tcPr>
-            <w:tcBorders>
-              <w:top w:val="single" w:space="0" w:color="D3D3D3"/>
-              <w:bottom w:val="single" w:space="0" w:color="D3D3D3"/>
-              <w:start w:val="single" w:space="0" w:color="D3D3D3"/>
-              <w:end w:val="single" w:space="0" w:color="D3D3D3"/>
-            </w:tcBorders>
-          </w:tcPr>
-          <w:p>
-            <w:pPr>
-              <w:spacing w:before="0" w:after="60"/>
-              <w:keepNext/>
-              <w:jc w:val="center"/>
-            </w:pPr>
-            <w:r>
-              <w:rPr>
-                <w:rFonts w:ascii="Calibri" w:hAnsi="Calibri"/>
-                <w:sz w:val="20"/>
-              </w:rPr>
-              <w:t xml:space="default">0.47</w:t>
+              <w:t xml:space="default">0.00 (-0.01 to 0.02)</w:t>
+            </w:r>
+          </w:p>
+        </w:tc>
+        <w:tc>
+          <w:tcPr>
+            <w:tcBorders>
+              <w:top w:val="single" w:space="0" w:color="D3D3D3"/>
+              <w:bottom w:val="single" w:space="0" w:color="D3D3D3"/>
+              <w:start w:val="single" w:space="0" w:color="D3D3D3"/>
+              <w:end w:val="single" w:space="0" w:color="D3D3D3"/>
+            </w:tcBorders>
+          </w:tcPr>
+          <w:p>
+            <w:pPr>
+              <w:spacing w:before="0" w:after="60"/>
+              <w:keepNext/>
+              <w:jc w:val="center"/>
+            </w:pPr>
+            <w:r>
+              <w:rPr>
+                <w:rFonts w:ascii="Calibri" w:hAnsi="Calibri"/>
+                <w:sz w:val="20"/>
+              </w:rPr>
+              <w:t xml:space="default">0.52</w:t>
             </w:r>
           </w:p>
         </w:tc>
@@ -1739,7 +1739,7 @@
                 <w:rFonts w:ascii="Calibri" w:hAnsi="Calibri"/>
                 <w:sz w:val="20"/>
               </w:rPr>
-              <w:t xml:space="default">0.82</w:t>
+              <w:t xml:space="default">0.87</w:t>
             </w:r>
           </w:p>
         </w:tc>
@@ -1816,55 +1816,55 @@
                 <w:rFonts w:ascii="Calibri" w:hAnsi="Calibri"/>
                 <w:sz w:val="20"/>
               </w:rPr>
-              <w:t xml:space="default">0.55</w:t>
-            </w:r>
-          </w:p>
-        </w:tc>
-        <w:tc>
-          <w:tcPr>
-            <w:tcBorders>
-              <w:top w:val="single" w:space="0" w:color="D3D3D3"/>
-              <w:bottom w:val="single" w:space="0" w:color="D3D3D3"/>
-              <w:start w:val="single" w:space="0" w:color="D3D3D3"/>
-              <w:end w:val="single" w:space="0" w:color="D3D3D3"/>
-            </w:tcBorders>
-          </w:tcPr>
-          <w:p>
-            <w:pPr>
-              <w:spacing w:before="0" w:after="60"/>
-              <w:keepNext/>
-              <w:jc w:val="center"/>
-            </w:pPr>
-            <w:r>
-              <w:rPr>
-                <w:rFonts w:ascii="Calibri" w:hAnsi="Calibri"/>
-                <w:sz w:val="20"/>
-              </w:rPr>
-              <w:t xml:space="default">0.02 (-0.06 to 0.10)</w:t>
-            </w:r>
-          </w:p>
-        </w:tc>
-        <w:tc>
-          <w:tcPr>
-            <w:tcBorders>
-              <w:top w:val="single" w:space="0" w:color="D3D3D3"/>
-              <w:bottom w:val="single" w:space="0" w:color="D3D3D3"/>
-              <w:start w:val="single" w:space="0" w:color="D3D3D3"/>
-              <w:end w:val="single" w:space="0" w:color="D3D3D3"/>
-            </w:tcBorders>
-          </w:tcPr>
-          <w:p>
-            <w:pPr>
-              <w:spacing w:before="0" w:after="60"/>
-              <w:keepNext/>
-              <w:jc w:val="center"/>
-            </w:pPr>
-            <w:r>
-              <w:rPr>
-                <w:rFonts w:ascii="Calibri" w:hAnsi="Calibri"/>
-                <w:sz w:val="20"/>
-              </w:rPr>
-              <w:t xml:space="default">0.60</w:t>
+              <w:t xml:space="default">0.56</w:t>
+            </w:r>
+          </w:p>
+        </w:tc>
+        <w:tc>
+          <w:tcPr>
+            <w:tcBorders>
+              <w:top w:val="single" w:space="0" w:color="D3D3D3"/>
+              <w:bottom w:val="single" w:space="0" w:color="D3D3D3"/>
+              <w:start w:val="single" w:space="0" w:color="D3D3D3"/>
+              <w:end w:val="single" w:space="0" w:color="D3D3D3"/>
+            </w:tcBorders>
+          </w:tcPr>
+          <w:p>
+            <w:pPr>
+              <w:spacing w:before="0" w:after="60"/>
+              <w:keepNext/>
+              <w:jc w:val="center"/>
+            </w:pPr>
+            <w:r>
+              <w:rPr>
+                <w:rFonts w:ascii="Calibri" w:hAnsi="Calibri"/>
+                <w:sz w:val="20"/>
+              </w:rPr>
+              <w:t xml:space="default">0.03 (-0.05 to 0.11)</w:t>
+            </w:r>
+          </w:p>
+        </w:tc>
+        <w:tc>
+          <w:tcPr>
+            <w:tcBorders>
+              <w:top w:val="single" w:space="0" w:color="D3D3D3"/>
+              <w:bottom w:val="single" w:space="0" w:color="D3D3D3"/>
+              <w:start w:val="single" w:space="0" w:color="D3D3D3"/>
+              <w:end w:val="single" w:space="0" w:color="D3D3D3"/>
+            </w:tcBorders>
+          </w:tcPr>
+          <w:p>
+            <w:pPr>
+              <w:spacing w:before="0" w:after="60"/>
+              <w:keepNext/>
+              <w:jc w:val="center"/>
+            </w:pPr>
+            <w:r>
+              <w:rPr>
+                <w:rFonts w:ascii="Calibri" w:hAnsi="Calibri"/>
+                <w:sz w:val="20"/>
+              </w:rPr>
+              <w:t xml:space="default">0.53</w:t>
             </w:r>
           </w:p>
         </w:tc>
@@ -2115,7 +2115,7 @@
                 <w:rFonts w:ascii="Calibri" w:hAnsi="Calibri"/>
                 <w:sz w:val="20"/>
               </w:rPr>
-              <w:t xml:space="default">0.64</w:t>
+              <w:t xml:space="default">0.70</w:t>
             </w:r>
           </w:p>
         </w:tc>
@@ -2342,7 +2342,7 @@
                 <w:rFonts w:ascii="Calibri" w:hAnsi="Calibri"/>
                 <w:sz w:val="20"/>
               </w:rPr>
-              <w:t xml:space="default">0.00 (-0.02 to 0.01)</w:t>
+              <w:t xml:space="default">0.00 (-0.02 to 0.02)</w:t>
             </w:r>
           </w:p>
         </w:tc>
@@ -2443,55 +2443,55 @@
                 <w:rFonts w:ascii="Calibri" w:hAnsi="Calibri"/>
                 <w:sz w:val="20"/>
               </w:rPr>
-              <w:t xml:space="default">0.058</w:t>
-            </w:r>
-          </w:p>
-        </w:tc>
-        <w:tc>
-          <w:tcPr>
-            <w:tcBorders>
-              <w:top w:val="single" w:space="0" w:color="D3D3D3"/>
-              <w:bottom w:val="single" w:space="0" w:color="D3D3D3"/>
-              <w:start w:val="single" w:space="0" w:color="D3D3D3"/>
-              <w:end w:val="single" w:space="0" w:color="D3D3D3"/>
-            </w:tcBorders>
-          </w:tcPr>
-          <w:p>
-            <w:pPr>
-              <w:spacing w:before="0" w:after="60"/>
-              <w:keepNext/>
-              <w:jc w:val="center"/>
-            </w:pPr>
-            <w:r>
-              <w:rPr>
-                <w:rFonts w:ascii="Calibri" w:hAnsi="Calibri"/>
-                <w:sz w:val="20"/>
-              </w:rPr>
-              <w:t xml:space="default">-0.04 (-0.13 to 0.04)</w:t>
-            </w:r>
-          </w:p>
-        </w:tc>
-        <w:tc>
-          <w:tcPr>
-            <w:tcBorders>
-              <w:top w:val="single" w:space="0" w:color="D3D3D3"/>
-              <w:bottom w:val="single" w:space="0" w:color="D3D3D3"/>
-              <w:start w:val="single" w:space="0" w:color="D3D3D3"/>
-              <w:end w:val="single" w:space="0" w:color="D3D3D3"/>
-            </w:tcBorders>
-          </w:tcPr>
-          <w:p>
-            <w:pPr>
-              <w:spacing w:before="0" w:after="60"/>
-              <w:keepNext/>
-              <w:jc w:val="center"/>
-            </w:pPr>
-            <w:r>
-              <w:rPr>
-                <w:rFonts w:ascii="Calibri" w:hAnsi="Calibri"/>
-                <w:sz w:val="20"/>
-              </w:rPr>
-              <w:t xml:space="default">0.30</w:t>
+              <w:t xml:space="default">0.059</w:t>
+            </w:r>
+          </w:p>
+        </w:tc>
+        <w:tc>
+          <w:tcPr>
+            <w:tcBorders>
+              <w:top w:val="single" w:space="0" w:color="D3D3D3"/>
+              <w:bottom w:val="single" w:space="0" w:color="D3D3D3"/>
+              <w:start w:val="single" w:space="0" w:color="D3D3D3"/>
+              <w:end w:val="single" w:space="0" w:color="D3D3D3"/>
+            </w:tcBorders>
+          </w:tcPr>
+          <w:p>
+            <w:pPr>
+              <w:spacing w:before="0" w:after="60"/>
+              <w:keepNext/>
+              <w:jc w:val="center"/>
+            </w:pPr>
+            <w:r>
+              <w:rPr>
+                <w:rFonts w:ascii="Calibri" w:hAnsi="Calibri"/>
+                <w:sz w:val="20"/>
+              </w:rPr>
+              <w:t xml:space="default">-0.05 (-0.13 to 0.04)</w:t>
+            </w:r>
+          </w:p>
+        </w:tc>
+        <w:tc>
+          <w:tcPr>
+            <w:tcBorders>
+              <w:top w:val="single" w:space="0" w:color="D3D3D3"/>
+              <w:bottom w:val="single" w:space="0" w:color="D3D3D3"/>
+              <w:start w:val="single" w:space="0" w:color="D3D3D3"/>
+              <w:end w:val="single" w:space="0" w:color="D3D3D3"/>
+            </w:tcBorders>
+          </w:tcPr>
+          <w:p>
+            <w:pPr>
+              <w:spacing w:before="0" w:after="60"/>
+              <w:keepNext/>
+              <w:jc w:val="center"/>
+            </w:pPr>
+            <w:r>
+              <w:rPr>
+                <w:rFonts w:ascii="Calibri" w:hAnsi="Calibri"/>
+                <w:sz w:val="20"/>
+              </w:rPr>
+              <w:t xml:space="default">0.29</w:t>
             </w:r>
           </w:p>
         </w:tc>
@@ -2742,7 +2742,7 @@
                 <w:rFonts w:ascii="Calibri" w:hAnsi="Calibri"/>
                 <w:sz w:val="20"/>
               </w:rPr>
-              <w:t xml:space="default">0.37</w:t>
+              <w:t xml:space="default">0.38</w:t>
             </w:r>
           </w:p>
         </w:tc>
@@ -2921,7 +2921,7 @@
                 <w:rFonts w:ascii="Calibri" w:hAnsi="Calibri"/>
                 <w:sz w:val="20"/>
               </w:rPr>
-              <w:t xml:space="default">-3.2 (-4.4 to -2.0)</w:t>
+              <w:t xml:space="default">-3.2 (-4.3 to -2.0)</w:t>
             </w:r>
           </w:p>
         </w:tc>
@@ -2970,7 +2970,7 @@
                 <w:rFonts w:ascii="Calibri" w:hAnsi="Calibri"/>
                 <w:sz w:val="20"/>
               </w:rPr>
-              <w:t xml:space="default">-2.9 (-4.2 to -1.6)</w:t>
+              <w:t xml:space="default">-2.8 (-4.1 to -1.5)</w:t>
             </w:r>
           </w:p>
         </w:tc>
@@ -3048,7 +3048,7 @@
                 <w:rFonts w:ascii="Calibri" w:hAnsi="Calibri"/>
                 <w:sz w:val="20"/>
               </w:rPr>
-              <w:t xml:space="default">-3.3 (-7.3 to 0.71)</w:t>
+              <w:t xml:space="default">-3.2 (-7.2 to 0.75)</w:t>
             </w:r>
           </w:p>
         </w:tc>
@@ -3096,31 +3096,31 @@
                 <w:rFonts w:ascii="Calibri" w:hAnsi="Calibri"/>
                 <w:sz w:val="20"/>
               </w:rPr>
-              <w:t xml:space="default">-3.4 (-8.9 to 2.1)</w:t>
-            </w:r>
-          </w:p>
-        </w:tc>
-        <w:tc>
-          <w:tcPr>
-            <w:tcBorders>
-              <w:top w:val="single" w:space="0" w:color="D3D3D3"/>
-              <w:bottom w:val="single" w:space="0" w:color="D3D3D3"/>
-              <w:start w:val="single" w:space="0" w:color="D3D3D3"/>
-              <w:end w:val="single" w:space="0" w:color="D3D3D3"/>
-            </w:tcBorders>
-          </w:tcPr>
-          <w:p>
-            <w:pPr>
-              <w:spacing w:before="0" w:after="60"/>
-              <w:keepNext/>
-              <w:jc w:val="center"/>
-            </w:pPr>
-            <w:r>
-              <w:rPr>
-                <w:rFonts w:ascii="Calibri" w:hAnsi="Calibri"/>
-                <w:sz w:val="20"/>
-              </w:rPr>
-              <w:t xml:space="default">0.23</w:t>
+              <w:t xml:space="default">-3.0 (-8.5 to 2.5)</w:t>
+            </w:r>
+          </w:p>
+        </w:tc>
+        <w:tc>
+          <w:tcPr>
+            <w:tcBorders>
+              <w:top w:val="single" w:space="0" w:color="D3D3D3"/>
+              <w:bottom w:val="single" w:space="0" w:color="D3D3D3"/>
+              <w:start w:val="single" w:space="0" w:color="D3D3D3"/>
+              <w:end w:val="single" w:space="0" w:color="D3D3D3"/>
+            </w:tcBorders>
+          </w:tcPr>
+          <w:p>
+            <w:pPr>
+              <w:spacing w:before="0" w:after="60"/>
+              <w:keepNext/>
+              <w:jc w:val="center"/>
+            </w:pPr>
+            <w:r>
+              <w:rPr>
+                <w:rFonts w:ascii="Calibri" w:hAnsi="Calibri"/>
+                <w:sz w:val="20"/>
+              </w:rPr>
+              <w:t xml:space="default">0.28</w:t>
             </w:r>
           </w:p>
         </w:tc>
@@ -3347,31 +3347,31 @@
                 <w:rFonts w:ascii="Calibri" w:hAnsi="Calibri"/>
                 <w:sz w:val="20"/>
               </w:rPr>
-              <w:t xml:space="default">0.26 (-0.52 to 1.0)</w:t>
-            </w:r>
-          </w:p>
-        </w:tc>
-        <w:tc>
-          <w:tcPr>
-            <w:tcBorders>
-              <w:top w:val="single" w:space="0" w:color="D3D3D3"/>
-              <w:bottom w:val="single" w:space="0" w:color="D3D3D3"/>
-              <w:start w:val="single" w:space="0" w:color="D3D3D3"/>
-              <w:end w:val="single" w:space="0" w:color="D3D3D3"/>
-            </w:tcBorders>
-          </w:tcPr>
-          <w:p>
-            <w:pPr>
-              <w:spacing w:before="0" w:after="60"/>
-              <w:keepNext/>
-              <w:jc w:val="center"/>
-            </w:pPr>
-            <w:r>
-              <w:rPr>
-                <w:rFonts w:ascii="Calibri" w:hAnsi="Calibri"/>
-                <w:sz w:val="20"/>
-              </w:rPr>
-              <w:t xml:space="default">0.51</w:t>
+              <w:t xml:space="default">0.28 (-0.51 to 1.1)</w:t>
+            </w:r>
+          </w:p>
+        </w:tc>
+        <w:tc>
+          <w:tcPr>
+            <w:tcBorders>
+              <w:top w:val="single" w:space="0" w:color="D3D3D3"/>
+              <w:bottom w:val="single" w:space="0" w:color="D3D3D3"/>
+              <w:start w:val="single" w:space="0" w:color="D3D3D3"/>
+              <w:end w:val="single" w:space="0" w:color="D3D3D3"/>
+            </w:tcBorders>
+          </w:tcPr>
+          <w:p>
+            <w:pPr>
+              <w:spacing w:before="0" w:after="60"/>
+              <w:keepNext/>
+              <w:jc w:val="center"/>
+            </w:pPr>
+            <w:r>
+              <w:rPr>
+                <w:rFonts w:ascii="Calibri" w:hAnsi="Calibri"/>
+                <w:sz w:val="20"/>
+              </w:rPr>
+              <w:t xml:space="default">0.49</w:t>
             </w:r>
           </w:p>
         </w:tc>
@@ -3599,7 +3599,7 @@
                 <w:rFonts w:ascii="Calibri" w:hAnsi="Calibri"/>
                 <w:sz w:val="20"/>
               </w:rPr>
-              <w:t xml:space="default">1.3 (0.36 to 2.2)</w:t>
+              <w:t xml:space="default">1.3 (0.35 to 2.2)</w:t>
             </w:r>
           </w:p>
         </w:tc>
@@ -3677,7 +3677,7 @@
                 <w:rFonts w:ascii="Calibri" w:hAnsi="Calibri"/>
                 <w:sz w:val="20"/>
               </w:rPr>
-              <w:t xml:space="default">3.2 (0.51 to 5.9)</w:t>
+              <w:t xml:space="default">3.2 (0.47 to 5.8)</w:t>
             </w:r>
           </w:p>
         </w:tc>
@@ -3702,55 +3702,55 @@
                 <w:sz w:val="20"/>
                 <w:b w:val="true"/>
               </w:rPr>
-              <w:t xml:space="default">0.020</w:t>
-            </w:r>
-          </w:p>
-        </w:tc>
-        <w:tc>
-          <w:tcPr>
-            <w:tcBorders>
-              <w:top w:val="single" w:space="0" w:color="D3D3D3"/>
-              <w:bottom w:val="single" w:space="0" w:color="D3D3D3"/>
-              <w:start w:val="single" w:space="0" w:color="D3D3D3"/>
-              <w:end w:val="single" w:space="0" w:color="D3D3D3"/>
-            </w:tcBorders>
-          </w:tcPr>
-          <w:p>
-            <w:pPr>
-              <w:spacing w:before="0" w:after="60"/>
-              <w:keepNext/>
-              <w:jc w:val="center"/>
-            </w:pPr>
-            <w:r>
-              <w:rPr>
-                <w:rFonts w:ascii="Calibri" w:hAnsi="Calibri"/>
-                <w:sz w:val="20"/>
-              </w:rPr>
-              <w:t xml:space="default">1.8 (-2.1 to 5.8)</w:t>
-            </w:r>
-          </w:p>
-        </w:tc>
-        <w:tc>
-          <w:tcPr>
-            <w:tcBorders>
-              <w:top w:val="single" w:space="0" w:color="D3D3D3"/>
-              <w:bottom w:val="single" w:space="0" w:color="D3D3D3"/>
-              <w:start w:val="single" w:space="0" w:color="D3D3D3"/>
-              <w:end w:val="single" w:space="0" w:color="D3D3D3"/>
-            </w:tcBorders>
-          </w:tcPr>
-          <w:p>
-            <w:pPr>
-              <w:spacing w:before="0" w:after="60"/>
-              <w:keepNext/>
-              <w:jc w:val="center"/>
-            </w:pPr>
-            <w:r>
-              <w:rPr>
-                <w:rFonts w:ascii="Calibri" w:hAnsi="Calibri"/>
-                <w:sz w:val="20"/>
-              </w:rPr>
-              <w:t xml:space="default">0.36</w:t>
+              <w:t xml:space="default">0.021</w:t>
+            </w:r>
+          </w:p>
+        </w:tc>
+        <w:tc>
+          <w:tcPr>
+            <w:tcBorders>
+              <w:top w:val="single" w:space="0" w:color="D3D3D3"/>
+              <w:bottom w:val="single" w:space="0" w:color="D3D3D3"/>
+              <w:start w:val="single" w:space="0" w:color="D3D3D3"/>
+              <w:end w:val="single" w:space="0" w:color="D3D3D3"/>
+            </w:tcBorders>
+          </w:tcPr>
+          <w:p>
+            <w:pPr>
+              <w:spacing w:before="0" w:after="60"/>
+              <w:keepNext/>
+              <w:jc w:val="center"/>
+            </w:pPr>
+            <w:r>
+              <w:rPr>
+                <w:rFonts w:ascii="Calibri" w:hAnsi="Calibri"/>
+                <w:sz w:val="20"/>
+              </w:rPr>
+              <w:t xml:space="default">1.7 (-2.2 to 5.7)</w:t>
+            </w:r>
+          </w:p>
+        </w:tc>
+        <w:tc>
+          <w:tcPr>
+            <w:tcBorders>
+              <w:top w:val="single" w:space="0" w:color="D3D3D3"/>
+              <w:bottom w:val="single" w:space="0" w:color="D3D3D3"/>
+              <w:start w:val="single" w:space="0" w:color="D3D3D3"/>
+              <w:end w:val="single" w:space="0" w:color="D3D3D3"/>
+            </w:tcBorders>
+          </w:tcPr>
+          <w:p>
+            <w:pPr>
+              <w:spacing w:before="0" w:after="60"/>
+              <w:keepNext/>
+              <w:jc w:val="center"/>
+            </w:pPr>
+            <w:r>
+              <w:rPr>
+                <w:rFonts w:ascii="Calibri" w:hAnsi="Calibri"/>
+                <w:sz w:val="20"/>
+              </w:rPr>
+              <w:t xml:space="default">0.38</w:t>
             </w:r>
           </w:p>
         </w:tc>
@@ -3977,31 +3977,31 @@
                 <w:rFonts w:ascii="Calibri" w:hAnsi="Calibri"/>
                 <w:sz w:val="20"/>
               </w:rPr>
-              <w:t xml:space="default">-0.29 (-0.87 to 0.28)</w:t>
-            </w:r>
-          </w:p>
-        </w:tc>
-        <w:tc>
-          <w:tcPr>
-            <w:tcBorders>
-              <w:top w:val="single" w:space="0" w:color="D3D3D3"/>
-              <w:bottom w:val="single" w:space="0" w:color="D3D3D3"/>
-              <w:start w:val="single" w:space="0" w:color="D3D3D3"/>
-              <w:end w:val="single" w:space="0" w:color="D3D3D3"/>
-            </w:tcBorders>
-          </w:tcPr>
-          <w:p>
-            <w:pPr>
-              <w:spacing w:before="0" w:after="60"/>
-              <w:keepNext/>
-              <w:jc w:val="center"/>
-            </w:pPr>
-            <w:r>
-              <w:rPr>
-                <w:rFonts w:ascii="Calibri" w:hAnsi="Calibri"/>
-                <w:sz w:val="20"/>
-              </w:rPr>
-              <w:t xml:space="default">0.31</w:t>
+              <w:t xml:space="default">-0.30 (-0.87 to 0.27)</w:t>
+            </w:r>
+          </w:p>
+        </w:tc>
+        <w:tc>
+          <w:tcPr>
+            <w:tcBorders>
+              <w:top w:val="single" w:space="0" w:color="D3D3D3"/>
+              <w:bottom w:val="single" w:space="0" w:color="D3D3D3"/>
+              <w:start w:val="single" w:space="0" w:color="D3D3D3"/>
+              <w:end w:val="single" w:space="0" w:color="D3D3D3"/>
+            </w:tcBorders>
+          </w:tcPr>
+          <w:p>
+            <w:pPr>
+              <w:spacing w:before="0" w:after="60"/>
+              <w:keepNext/>
+              <w:jc w:val="center"/>
+            </w:pPr>
+            <w:r>
+              <w:rPr>
+                <w:rFonts w:ascii="Calibri" w:hAnsi="Calibri"/>
+                <w:sz w:val="20"/>
+              </w:rPr>
+              <w:t xml:space="default">0.30</w:t>
             </w:r>
           </w:p>
         </w:tc>
@@ -4332,55 +4332,55 @@
                 <w:sz w:val="20"/>
                 <w:b w:val="true"/>
               </w:rPr>
-              <w:t xml:space="default">0.033</w:t>
-            </w:r>
-          </w:p>
-        </w:tc>
-        <w:tc>
-          <w:tcPr>
-            <w:tcBorders>
-              <w:top w:val="single" w:space="0" w:color="D3D3D3"/>
-              <w:bottom w:val="single" w:space="0" w:color="D3D3D3"/>
-              <w:start w:val="single" w:space="0" w:color="D3D3D3"/>
-              <w:end w:val="single" w:space="0" w:color="D3D3D3"/>
-            </w:tcBorders>
-          </w:tcPr>
-          <w:p>
-            <w:pPr>
-              <w:spacing w:before="0" w:after="60"/>
-              <w:keepNext/>
-              <w:jc w:val="center"/>
-            </w:pPr>
-            <w:r>
-              <w:rPr>
-                <w:rFonts w:ascii="Calibri" w:hAnsi="Calibri"/>
-                <w:sz w:val="20"/>
-              </w:rPr>
-              <w:t xml:space="default">0.01 (-0.01 to 0.03)</w:t>
-            </w:r>
-          </w:p>
-        </w:tc>
-        <w:tc>
-          <w:tcPr>
-            <w:tcBorders>
-              <w:top w:val="single" w:space="0" w:color="D3D3D3"/>
-              <w:bottom w:val="single" w:space="0" w:color="D3D3D3"/>
-              <w:start w:val="single" w:space="0" w:color="D3D3D3"/>
-              <w:end w:val="single" w:space="0" w:color="D3D3D3"/>
-            </w:tcBorders>
-          </w:tcPr>
-          <w:p>
-            <w:pPr>
-              <w:spacing w:before="0" w:after="60"/>
-              <w:keepNext/>
-              <w:jc w:val="center"/>
-            </w:pPr>
-            <w:r>
-              <w:rPr>
-                <w:rFonts w:ascii="Calibri" w:hAnsi="Calibri"/>
-                <w:sz w:val="20"/>
-              </w:rPr>
-              <w:t xml:space="default">0.44</w:t>
+              <w:t xml:space="default">0.034</w:t>
+            </w:r>
+          </w:p>
+        </w:tc>
+        <w:tc>
+          <w:tcPr>
+            <w:tcBorders>
+              <w:top w:val="single" w:space="0" w:color="D3D3D3"/>
+              <w:bottom w:val="single" w:space="0" w:color="D3D3D3"/>
+              <w:start w:val="single" w:space="0" w:color="D3D3D3"/>
+              <w:end w:val="single" w:space="0" w:color="D3D3D3"/>
+            </w:tcBorders>
+          </w:tcPr>
+          <w:p>
+            <w:pPr>
+              <w:spacing w:before="0" w:after="60"/>
+              <w:keepNext/>
+              <w:jc w:val="center"/>
+            </w:pPr>
+            <w:r>
+              <w:rPr>
+                <w:rFonts w:ascii="Calibri" w:hAnsi="Calibri"/>
+                <w:sz w:val="20"/>
+              </w:rPr>
+              <w:t xml:space="default">0.01 (-0.02 to 0.03)</w:t>
+            </w:r>
+          </w:p>
+        </w:tc>
+        <w:tc>
+          <w:tcPr>
+            <w:tcBorders>
+              <w:top w:val="single" w:space="0" w:color="D3D3D3"/>
+              <w:bottom w:val="single" w:space="0" w:color="D3D3D3"/>
+              <w:start w:val="single" w:space="0" w:color="D3D3D3"/>
+              <w:end w:val="single" w:space="0" w:color="D3D3D3"/>
+            </w:tcBorders>
+          </w:tcPr>
+          <w:p>
+            <w:pPr>
+              <w:spacing w:before="0" w:after="60"/>
+              <w:keepNext/>
+              <w:jc w:val="center"/>
+            </w:pPr>
+            <w:r>
+              <w:rPr>
+                <w:rFonts w:ascii="Calibri" w:hAnsi="Calibri"/>
+                <w:sz w:val="20"/>
+              </w:rPr>
+              <w:t xml:space="default">0.48</w:t>
             </w:r>
           </w:p>
         </w:tc>
@@ -4631,7 +4631,7 @@
                 <w:rFonts w:ascii="Calibri" w:hAnsi="Calibri"/>
                 <w:sz w:val="20"/>
               </w:rPr>
-              <w:t xml:space="default">0.39</w:t>
+              <w:t xml:space="default">0.38</w:t>
             </w:r>
           </w:p>
         </w:tc>
@@ -4937,79 +4937,79 @@
                 <w:rFonts w:ascii="Calibri" w:hAnsi="Calibri"/>
                 <w:sz w:val="20"/>
               </w:rPr>
-              <w:t xml:space="default">0.30 (-0.04 to 0.64)</w:t>
-            </w:r>
-          </w:p>
-        </w:tc>
-        <w:tc>
-          <w:tcPr>
-            <w:tcBorders>
-              <w:top w:val="single" w:space="0" w:color="D3D3D3"/>
-              <w:bottom w:val="single" w:space="0" w:color="D3D3D3"/>
-              <w:start w:val="single" w:space="0" w:color="D3D3D3"/>
-              <w:end w:val="single" w:space="0" w:color="D3D3D3"/>
-            </w:tcBorders>
-          </w:tcPr>
-          <w:p>
-            <w:pPr>
-              <w:spacing w:before="0" w:after="60"/>
-              <w:keepNext/>
-              <w:jc w:val="center"/>
-            </w:pPr>
-            <w:r>
-              <w:rPr>
-                <w:rFonts w:ascii="Calibri" w:hAnsi="Calibri"/>
-                <w:sz w:val="20"/>
-              </w:rPr>
-              <w:t xml:space="default">0.082</w:t>
-            </w:r>
-          </w:p>
-        </w:tc>
-        <w:tc>
-          <w:tcPr>
-            <w:tcBorders>
-              <w:top w:val="single" w:space="0" w:color="D3D3D3"/>
-              <w:bottom w:val="single" w:space="0" w:color="D3D3D3"/>
-              <w:start w:val="single" w:space="0" w:color="D3D3D3"/>
-              <w:end w:val="single" w:space="0" w:color="D3D3D3"/>
-            </w:tcBorders>
-          </w:tcPr>
-          <w:p>
-            <w:pPr>
-              <w:spacing w:before="0" w:after="60"/>
-              <w:keepNext/>
-              <w:jc w:val="center"/>
-            </w:pPr>
-            <w:r>
-              <w:rPr>
-                <w:rFonts w:ascii="Calibri" w:hAnsi="Calibri"/>
-                <w:sz w:val="20"/>
-              </w:rPr>
-              <w:t xml:space="default">0.16 (-0.35 to 0.66)</w:t>
-            </w:r>
-          </w:p>
-        </w:tc>
-        <w:tc>
-          <w:tcPr>
-            <w:tcBorders>
-              <w:top w:val="single" w:space="0" w:color="D3D3D3"/>
-              <w:bottom w:val="single" w:space="0" w:color="D3D3D3"/>
-              <w:start w:val="single" w:space="0" w:color="D3D3D3"/>
-              <w:end w:val="single" w:space="0" w:color="D3D3D3"/>
-            </w:tcBorders>
-          </w:tcPr>
-          <w:p>
-            <w:pPr>
-              <w:spacing w:before="0" w:after="60"/>
-              <w:keepNext/>
-              <w:jc w:val="center"/>
-            </w:pPr>
-            <w:r>
-              <w:rPr>
-                <w:rFonts w:ascii="Calibri" w:hAnsi="Calibri"/>
-                <w:sz w:val="20"/>
-              </w:rPr>
-              <w:t xml:space="default">0.54</w:t>
+              <w:t xml:space="default">0.29 (-0.05 to 0.63)</w:t>
+            </w:r>
+          </w:p>
+        </w:tc>
+        <w:tc>
+          <w:tcPr>
+            <w:tcBorders>
+              <w:top w:val="single" w:space="0" w:color="D3D3D3"/>
+              <w:bottom w:val="single" w:space="0" w:color="D3D3D3"/>
+              <w:start w:val="single" w:space="0" w:color="D3D3D3"/>
+              <w:end w:val="single" w:space="0" w:color="D3D3D3"/>
+            </w:tcBorders>
+          </w:tcPr>
+          <w:p>
+            <w:pPr>
+              <w:spacing w:before="0" w:after="60"/>
+              <w:keepNext/>
+              <w:jc w:val="center"/>
+            </w:pPr>
+            <w:r>
+              <w:rPr>
+                <w:rFonts w:ascii="Calibri" w:hAnsi="Calibri"/>
+                <w:sz w:val="20"/>
+              </w:rPr>
+              <w:t xml:space="default">0.094</w:t>
+            </w:r>
+          </w:p>
+        </w:tc>
+        <w:tc>
+          <w:tcPr>
+            <w:tcBorders>
+              <w:top w:val="single" w:space="0" w:color="D3D3D3"/>
+              <w:bottom w:val="single" w:space="0" w:color="D3D3D3"/>
+              <w:start w:val="single" w:space="0" w:color="D3D3D3"/>
+              <w:end w:val="single" w:space="0" w:color="D3D3D3"/>
+            </w:tcBorders>
+          </w:tcPr>
+          <w:p>
+            <w:pPr>
+              <w:spacing w:before="0" w:after="60"/>
+              <w:keepNext/>
+              <w:jc w:val="center"/>
+            </w:pPr>
+            <w:r>
+              <w:rPr>
+                <w:rFonts w:ascii="Calibri" w:hAnsi="Calibri"/>
+                <w:sz w:val="20"/>
+              </w:rPr>
+              <w:t xml:space="default">0.14 (-0.36 to 0.65)</w:t>
+            </w:r>
+          </w:p>
+        </w:tc>
+        <w:tc>
+          <w:tcPr>
+            <w:tcBorders>
+              <w:top w:val="single" w:space="0" w:color="D3D3D3"/>
+              <w:bottom w:val="single" w:space="0" w:color="D3D3D3"/>
+              <w:start w:val="single" w:space="0" w:color="D3D3D3"/>
+              <w:end w:val="single" w:space="0" w:color="D3D3D3"/>
+            </w:tcBorders>
+          </w:tcPr>
+          <w:p>
+            <w:pPr>
+              <w:spacing w:before="0" w:after="60"/>
+              <w:keepNext/>
+              <w:jc w:val="center"/>
+            </w:pPr>
+            <w:r>
+              <w:rPr>
+                <w:rFonts w:ascii="Calibri" w:hAnsi="Calibri"/>
+                <w:sz w:val="20"/>
+              </w:rPr>
+              <w:t xml:space="default">0.58</w:t>
             </w:r>
           </w:p>
         </w:tc>
@@ -5110,7 +5110,7 @@
                 <w:rFonts w:ascii="Calibri" w:hAnsi="Calibri"/>
                 <w:sz w:val="20"/>
               </w:rPr>
-              <w:t xml:space="default">-0.17 (-0.25 to -0.10)</w:t>
+              <w:t xml:space="default">-0.17 (-0.25 to -0.09)</w:t>
             </w:r>
           </w:p>
         </w:tc>
@@ -5236,31 +5236,31 @@
                 <w:rFonts w:ascii="Calibri" w:hAnsi="Calibri"/>
                 <w:sz w:val="20"/>
               </w:rPr>
-              <w:t xml:space="default">-0.06 (-0.14 to 0.01)</w:t>
-            </w:r>
-          </w:p>
-        </w:tc>
-        <w:tc>
-          <w:tcPr>
-            <w:tcBorders>
-              <w:top w:val="single" w:space="0" w:color="D3D3D3"/>
-              <w:bottom w:val="single" w:space="0" w:color="D3D3D3"/>
-              <w:start w:val="single" w:space="0" w:color="D3D3D3"/>
-              <w:end w:val="single" w:space="0" w:color="D3D3D3"/>
-            </w:tcBorders>
-          </w:tcPr>
-          <w:p>
-            <w:pPr>
-              <w:spacing w:before="0" w:after="60"/>
-              <w:keepNext/>
-              <w:jc w:val="center"/>
-            </w:pPr>
-            <w:r>
-              <w:rPr>
-                <w:rFonts w:ascii="Calibri" w:hAnsi="Calibri"/>
-                <w:sz w:val="20"/>
-              </w:rPr>
-              <w:t xml:space="default">0.082</w:t>
+              <w:t xml:space="default">-0.07 (-0.14 to 0.01)</w:t>
+            </w:r>
+          </w:p>
+        </w:tc>
+        <w:tc>
+          <w:tcPr>
+            <w:tcBorders>
+              <w:top w:val="single" w:space="0" w:color="D3D3D3"/>
+              <w:bottom w:val="single" w:space="0" w:color="D3D3D3"/>
+              <w:start w:val="single" w:space="0" w:color="D3D3D3"/>
+              <w:end w:val="single" w:space="0" w:color="D3D3D3"/>
+            </w:tcBorders>
+          </w:tcPr>
+          <w:p>
+            <w:pPr>
+              <w:spacing w:before="0" w:after="60"/>
+              <w:keepNext/>
+              <w:jc w:val="center"/>
+            </w:pPr>
+            <w:r>
+              <w:rPr>
+                <w:rFonts w:ascii="Calibri" w:hAnsi="Calibri"/>
+                <w:sz w:val="20"/>
+              </w:rPr>
+              <w:t xml:space="default">0.074</w:t>
             </w:r>
           </w:p>
         </w:tc>
@@ -5488,7 +5488,7 @@
                 <w:rFonts w:ascii="Calibri" w:hAnsi="Calibri"/>
                 <w:sz w:val="20"/>
               </w:rPr>
-              <w:t xml:space="default">2.2 (1.3 to 3.2)</w:t>
+              <w:t xml:space="default">2.2 (1.2 to 3.2)</w:t>
             </w:r>
           </w:p>
         </w:tc>
@@ -5566,79 +5566,79 @@
                 <w:rFonts w:ascii="Calibri" w:hAnsi="Calibri"/>
                 <w:sz w:val="20"/>
               </w:rPr>
-              <w:t xml:space="default">2.4 (-0.47 to 5.3)</w:t>
-            </w:r>
-          </w:p>
-        </w:tc>
-        <w:tc>
-          <w:tcPr>
-            <w:tcBorders>
-              <w:top w:val="single" w:space="0" w:color="D3D3D3"/>
-              <w:bottom w:val="single" w:space="0" w:color="D3D3D3"/>
-              <w:start w:val="single" w:space="0" w:color="D3D3D3"/>
-              <w:end w:val="single" w:space="0" w:color="D3D3D3"/>
-            </w:tcBorders>
-          </w:tcPr>
-          <w:p>
-            <w:pPr>
-              <w:spacing w:before="0" w:after="60"/>
-              <w:keepNext/>
-              <w:jc w:val="center"/>
-            </w:pPr>
-            <w:r>
-              <w:rPr>
-                <w:rFonts w:ascii="Calibri" w:hAnsi="Calibri"/>
-                <w:sz w:val="20"/>
-              </w:rPr>
-              <w:t xml:space="default">0.10</w:t>
-            </w:r>
-          </w:p>
-        </w:tc>
-        <w:tc>
-          <w:tcPr>
-            <w:tcBorders>
-              <w:top w:val="single" w:space="0" w:color="D3D3D3"/>
-              <w:bottom w:val="single" w:space="0" w:color="D3D3D3"/>
-              <w:start w:val="single" w:space="0" w:color="D3D3D3"/>
-              <w:end w:val="single" w:space="0" w:color="D3D3D3"/>
-            </w:tcBorders>
-          </w:tcPr>
-          <w:p>
-            <w:pPr>
-              <w:spacing w:before="0" w:after="60"/>
-              <w:keepNext/>
-              <w:jc w:val="center"/>
-            </w:pPr>
-            <w:r>
-              <w:rPr>
-                <w:rFonts w:ascii="Calibri" w:hAnsi="Calibri"/>
-                <w:sz w:val="20"/>
-              </w:rPr>
-              <w:t xml:space="default">1.1 (-3.0 to 5.3)</w:t>
-            </w:r>
-          </w:p>
-        </w:tc>
-        <w:tc>
-          <w:tcPr>
-            <w:tcBorders>
-              <w:top w:val="single" w:space="0" w:color="D3D3D3"/>
-              <w:bottom w:val="single" w:space="0" w:color="D3D3D3"/>
-              <w:start w:val="single" w:space="0" w:color="D3D3D3"/>
-              <w:end w:val="single" w:space="0" w:color="D3D3D3"/>
-            </w:tcBorders>
-          </w:tcPr>
-          <w:p>
-            <w:pPr>
-              <w:spacing w:before="0" w:after="60"/>
-              <w:keepNext/>
-              <w:jc w:val="center"/>
-            </w:pPr>
-            <w:r>
-              <w:rPr>
-                <w:rFonts w:ascii="Calibri" w:hAnsi="Calibri"/>
-                <w:sz w:val="20"/>
-              </w:rPr>
-              <w:t xml:space="default">0.59</w:t>
+              <w:t xml:space="default">2.3 (-0.54 to 5.2)</w:t>
+            </w:r>
+          </w:p>
+        </w:tc>
+        <w:tc>
+          <w:tcPr>
+            <w:tcBorders>
+              <w:top w:val="single" w:space="0" w:color="D3D3D3"/>
+              <w:bottom w:val="single" w:space="0" w:color="D3D3D3"/>
+              <w:start w:val="single" w:space="0" w:color="D3D3D3"/>
+              <w:end w:val="single" w:space="0" w:color="D3D3D3"/>
+            </w:tcBorders>
+          </w:tcPr>
+          <w:p>
+            <w:pPr>
+              <w:spacing w:before="0" w:after="60"/>
+              <w:keepNext/>
+              <w:jc w:val="center"/>
+            </w:pPr>
+            <w:r>
+              <w:rPr>
+                <w:rFonts w:ascii="Calibri" w:hAnsi="Calibri"/>
+                <w:sz w:val="20"/>
+              </w:rPr>
+              <w:t xml:space="default">0.11</w:t>
+            </w:r>
+          </w:p>
+        </w:tc>
+        <w:tc>
+          <w:tcPr>
+            <w:tcBorders>
+              <w:top w:val="single" w:space="0" w:color="D3D3D3"/>
+              <w:bottom w:val="single" w:space="0" w:color="D3D3D3"/>
+              <w:start w:val="single" w:space="0" w:color="D3D3D3"/>
+              <w:end w:val="single" w:space="0" w:color="D3D3D3"/>
+            </w:tcBorders>
+          </w:tcPr>
+          <w:p>
+            <w:pPr>
+              <w:spacing w:before="0" w:after="60"/>
+              <w:keepNext/>
+              <w:jc w:val="center"/>
+            </w:pPr>
+            <w:r>
+              <w:rPr>
+                <w:rFonts w:ascii="Calibri" w:hAnsi="Calibri"/>
+                <w:sz w:val="20"/>
+              </w:rPr>
+              <w:t xml:space="default">0.98 (-3.2 to 5.2)</w:t>
+            </w:r>
+          </w:p>
+        </w:tc>
+        <w:tc>
+          <w:tcPr>
+            <w:tcBorders>
+              <w:top w:val="single" w:space="0" w:color="D3D3D3"/>
+              <w:bottom w:val="single" w:space="0" w:color="D3D3D3"/>
+              <w:start w:val="single" w:space="0" w:color="D3D3D3"/>
+              <w:end w:val="single" w:space="0" w:color="D3D3D3"/>
+            </w:tcBorders>
+          </w:tcPr>
+          <w:p>
+            <w:pPr>
+              <w:spacing w:before="0" w:after="60"/>
+              <w:keepNext/>
+              <w:jc w:val="center"/>
+            </w:pPr>
+            <w:r>
+              <w:rPr>
+                <w:rFonts w:ascii="Calibri" w:hAnsi="Calibri"/>
+                <w:sz w:val="20"/>
+              </w:rPr>
+              <w:t xml:space="default">0.65</w:t>
             </w:r>
           </w:p>
         </w:tc>
@@ -5865,31 +5865,31 @@
                 <w:rFonts w:ascii="Calibri" w:hAnsi="Calibri"/>
                 <w:sz w:val="20"/>
               </w:rPr>
-              <w:t xml:space="default">-0.47 (-1.1 to 0.13)</w:t>
-            </w:r>
-          </w:p>
-        </w:tc>
-        <w:tc>
-          <w:tcPr>
-            <w:tcBorders>
-              <w:top w:val="single" w:space="0" w:color="D3D3D3"/>
-              <w:bottom w:val="single" w:space="0" w:color="D3D3D3"/>
-              <w:start w:val="single" w:space="0" w:color="D3D3D3"/>
-              <w:end w:val="single" w:space="0" w:color="D3D3D3"/>
-            </w:tcBorders>
-          </w:tcPr>
-          <w:p>
-            <w:pPr>
-              <w:spacing w:before="0" w:after="60"/>
-              <w:keepNext/>
-              <w:jc w:val="center"/>
-            </w:pPr>
-            <w:r>
-              <w:rPr>
-                <w:rFonts w:ascii="Calibri" w:hAnsi="Calibri"/>
-                <w:sz w:val="20"/>
-              </w:rPr>
-              <w:t xml:space="default">0.13</w:t>
+              <w:t xml:space="default">-0.48 (-1.1 to 0.12)</w:t>
+            </w:r>
+          </w:p>
+        </w:tc>
+        <w:tc>
+          <w:tcPr>
+            <w:tcBorders>
+              <w:top w:val="single" w:space="0" w:color="D3D3D3"/>
+              <w:bottom w:val="single" w:space="0" w:color="D3D3D3"/>
+              <w:start w:val="single" w:space="0" w:color="D3D3D3"/>
+              <w:end w:val="single" w:space="0" w:color="D3D3D3"/>
+            </w:tcBorders>
+          </w:tcPr>
+          <w:p>
+            <w:pPr>
+              <w:spacing w:before="0" w:after="60"/>
+              <w:keepNext/>
+              <w:jc w:val="center"/>
+            </w:pPr>
+            <w:r>
+              <w:rPr>
+                <w:rFonts w:ascii="Calibri" w:hAnsi="Calibri"/>
+                <w:sz w:val="20"/>
+              </w:rPr>
+              <w:t xml:space="default">0.12</w:t>
             </w:r>
           </w:p>
         </w:tc>
@@ -6068,79 +6068,79 @@
                 <w:rFonts w:ascii="Calibri" w:hAnsi="Calibri"/>
                 <w:sz w:val="20"/>
               </w:rPr>
-              <w:t xml:space="default">-0.15 (-0.46 to 0.16)</w:t>
-            </w:r>
-          </w:p>
-        </w:tc>
-        <w:tc>
-          <w:tcPr>
-            <w:tcBorders>
-              <w:top w:val="single" w:space="0" w:color="D3D3D3"/>
-              <w:bottom w:val="single" w:space="0" w:color="D3D3D3"/>
-              <w:start w:val="single" w:space="0" w:color="D3D3D3"/>
-              <w:end w:val="single" w:space="0" w:color="D3D3D3"/>
-            </w:tcBorders>
-          </w:tcPr>
-          <w:p>
-            <w:pPr>
-              <w:spacing w:before="0" w:after="60"/>
-              <w:keepNext/>
-              <w:jc w:val="center"/>
-            </w:pPr>
-            <w:r>
-              <w:rPr>
-                <w:rFonts w:ascii="Calibri" w:hAnsi="Calibri"/>
-                <w:sz w:val="20"/>
-              </w:rPr>
-              <w:t xml:space="default">0.34</w:t>
-            </w:r>
-          </w:p>
-        </w:tc>
-        <w:tc>
-          <w:tcPr>
-            <w:tcBorders>
-              <w:top w:val="single" w:space="0" w:color="D3D3D3"/>
-              <w:bottom w:val="single" w:space="0" w:color="D3D3D3"/>
-              <w:start w:val="single" w:space="0" w:color="D3D3D3"/>
-              <w:end w:val="single" w:space="0" w:color="D3D3D3"/>
-            </w:tcBorders>
-          </w:tcPr>
-          <w:p>
-            <w:pPr>
-              <w:spacing w:before="0" w:after="60"/>
-              <w:keepNext/>
-              <w:jc w:val="center"/>
-            </w:pPr>
-            <w:r>
-              <w:rPr>
-                <w:rFonts w:ascii="Calibri" w:hAnsi="Calibri"/>
-                <w:sz w:val="20"/>
-              </w:rPr>
-              <w:t xml:space="default">-0.11 (-0.47 to 0.26)</w:t>
-            </w:r>
-          </w:p>
-        </w:tc>
-        <w:tc>
-          <w:tcPr>
-            <w:tcBorders>
-              <w:top w:val="single" w:space="0" w:color="D3D3D3"/>
-              <w:bottom w:val="single" w:space="0" w:color="D3D3D3"/>
-              <w:start w:val="single" w:space="0" w:color="D3D3D3"/>
-              <w:end w:val="single" w:space="0" w:color="D3D3D3"/>
-            </w:tcBorders>
-          </w:tcPr>
-          <w:p>
-            <w:pPr>
-              <w:spacing w:before="0" w:after="60"/>
-              <w:keepNext/>
-              <w:jc w:val="center"/>
-            </w:pPr>
-            <w:r>
-              <w:rPr>
-                <w:rFonts w:ascii="Calibri" w:hAnsi="Calibri"/>
-                <w:sz w:val="20"/>
-              </w:rPr>
-              <w:t xml:space="default">0.57</w:t>
+              <w:t xml:space="default">-0.14 (-0.45 to 0.17)</w:t>
+            </w:r>
+          </w:p>
+        </w:tc>
+        <w:tc>
+          <w:tcPr>
+            <w:tcBorders>
+              <w:top w:val="single" w:space="0" w:color="D3D3D3"/>
+              <w:bottom w:val="single" w:space="0" w:color="D3D3D3"/>
+              <w:start w:val="single" w:space="0" w:color="D3D3D3"/>
+              <w:end w:val="single" w:space="0" w:color="D3D3D3"/>
+            </w:tcBorders>
+          </w:tcPr>
+          <w:p>
+            <w:pPr>
+              <w:spacing w:before="0" w:after="60"/>
+              <w:keepNext/>
+              <w:jc w:val="center"/>
+            </w:pPr>
+            <w:r>
+              <w:rPr>
+                <w:rFonts w:ascii="Calibri" w:hAnsi="Calibri"/>
+                <w:sz w:val="20"/>
+              </w:rPr>
+              <w:t xml:space="default">0.36</w:t>
+            </w:r>
+          </w:p>
+        </w:tc>
+        <w:tc>
+          <w:tcPr>
+            <w:tcBorders>
+              <w:top w:val="single" w:space="0" w:color="D3D3D3"/>
+              <w:bottom w:val="single" w:space="0" w:color="D3D3D3"/>
+              <w:start w:val="single" w:space="0" w:color="D3D3D3"/>
+              <w:end w:val="single" w:space="0" w:color="D3D3D3"/>
+            </w:tcBorders>
+          </w:tcPr>
+          <w:p>
+            <w:pPr>
+              <w:spacing w:before="0" w:after="60"/>
+              <w:keepNext/>
+              <w:jc w:val="center"/>
+            </w:pPr>
+            <w:r>
+              <w:rPr>
+                <w:rFonts w:ascii="Calibri" w:hAnsi="Calibri"/>
+                <w:sz w:val="20"/>
+              </w:rPr>
+              <w:t xml:space="default">-0.11 (-0.48 to 0.26)</w:t>
+            </w:r>
+          </w:p>
+        </w:tc>
+        <w:tc>
+          <w:tcPr>
+            <w:tcBorders>
+              <w:top w:val="single" w:space="0" w:color="D3D3D3"/>
+              <w:bottom w:val="single" w:space="0" w:color="D3D3D3"/>
+              <w:start w:val="single" w:space="0" w:color="D3D3D3"/>
+              <w:end w:val="single" w:space="0" w:color="D3D3D3"/>
+            </w:tcBorders>
+          </w:tcPr>
+          <w:p>
+            <w:pPr>
+              <w:spacing w:before="0" w:after="60"/>
+              <w:keepNext/>
+              <w:jc w:val="center"/>
+            </w:pPr>
+            <w:r>
+              <w:rPr>
+                <w:rFonts w:ascii="Calibri" w:hAnsi="Calibri"/>
+                <w:sz w:val="20"/>
+              </w:rPr>
+              <w:t xml:space="default">0.56</w:t>
             </w:r>
           </w:p>
         </w:tc>
@@ -6241,31 +6241,31 @@
                 <w:rFonts w:ascii="Calibri" w:hAnsi="Calibri"/>
                 <w:sz w:val="20"/>
               </w:rPr>
-              <w:t xml:space="default">0.48 (-1.1 to 2.0)</w:t>
-            </w:r>
-          </w:p>
-        </w:tc>
-        <w:tc>
-          <w:tcPr>
-            <w:tcBorders>
-              <w:top w:val="single" w:space="0" w:color="D3D3D3"/>
-              <w:bottom w:val="single" w:space="0" w:color="D3D3D3"/>
-              <w:start w:val="single" w:space="0" w:color="D3D3D3"/>
-              <w:end w:val="single" w:space="0" w:color="D3D3D3"/>
-            </w:tcBorders>
-          </w:tcPr>
-          <w:p>
-            <w:pPr>
-              <w:spacing w:before="0" w:after="60"/>
-              <w:keepNext/>
-              <w:jc w:val="center"/>
-            </w:pPr>
-            <w:r>
-              <w:rPr>
-                <w:rFonts w:ascii="Calibri" w:hAnsi="Calibri"/>
-                <w:sz w:val="20"/>
-              </w:rPr>
-              <w:t xml:space="default">0.55</w:t>
+              <w:t xml:space="default">0.46 (-1.1 to 2.0)</w:t>
+            </w:r>
+          </w:p>
+        </w:tc>
+        <w:tc>
+          <w:tcPr>
+            <w:tcBorders>
+              <w:top w:val="single" w:space="0" w:color="D3D3D3"/>
+              <w:bottom w:val="single" w:space="0" w:color="D3D3D3"/>
+              <w:start w:val="single" w:space="0" w:color="D3D3D3"/>
+              <w:end w:val="single" w:space="0" w:color="D3D3D3"/>
+            </w:tcBorders>
+          </w:tcPr>
+          <w:p>
+            <w:pPr>
+              <w:spacing w:before="0" w:after="60"/>
+              <w:keepNext/>
+              <w:jc w:val="center"/>
+            </w:pPr>
+            <w:r>
+              <w:rPr>
+                <w:rFonts w:ascii="Calibri" w:hAnsi="Calibri"/>
+                <w:sz w:val="20"/>
+              </w:rPr>
+              <w:t xml:space="default">0.57</w:t>
             </w:r>
           </w:p>
         </w:tc>
@@ -6391,7 +6391,7 @@
                 <w:sz w:val="20"/>
                 <w:b w:val="true"/>
               </w:rPr>
-              <w:t xml:space="default">0.027</w:t>
+              <w:t xml:space="default">0.026</w:t>
             </w:r>
           </w:p>
         </w:tc>
@@ -6492,31 +6492,31 @@
                 <w:rFonts w:ascii="Calibri" w:hAnsi="Calibri"/>
                 <w:sz w:val="20"/>
               </w:rPr>
-              <w:t xml:space="default">0.00 (-0.23 to 0.23)</w:t>
-            </w:r>
-          </w:p>
-        </w:tc>
-        <w:tc>
-          <w:tcPr>
-            <w:tcBorders>
-              <w:top w:val="single" w:space="0" w:color="D3D3D3"/>
-              <w:bottom w:val="single" w:space="0" w:color="D3D3D3"/>
-              <w:start w:val="single" w:space="0" w:color="D3D3D3"/>
-              <w:end w:val="single" w:space="0" w:color="D3D3D3"/>
-            </w:tcBorders>
-          </w:tcPr>
-          <w:p>
-            <w:pPr>
-              <w:spacing w:before="0" w:after="60"/>
-              <w:keepNext/>
-              <w:jc w:val="center"/>
-            </w:pPr>
-            <w:r>
-              <w:rPr>
-                <w:rFonts w:ascii="Calibri" w:hAnsi="Calibri"/>
-                <w:sz w:val="20"/>
-              </w:rPr>
-              <w:t xml:space="default">0.97</w:t>
+              <w:t xml:space="default">-0.01 (-0.24 to 0.22)</w:t>
+            </w:r>
+          </w:p>
+        </w:tc>
+        <w:tc>
+          <w:tcPr>
+            <w:tcBorders>
+              <w:top w:val="single" w:space="0" w:color="D3D3D3"/>
+              <w:bottom w:val="single" w:space="0" w:color="D3D3D3"/>
+              <w:start w:val="single" w:space="0" w:color="D3D3D3"/>
+              <w:end w:val="single" w:space="0" w:color="D3D3D3"/>
+            </w:tcBorders>
+          </w:tcPr>
+          <w:p>
+            <w:pPr>
+              <w:spacing w:before="0" w:after="60"/>
+              <w:keepNext/>
+              <w:jc w:val="center"/>
+            </w:pPr>
+            <w:r>
+              <w:rPr>
+                <w:rFonts w:ascii="Calibri" w:hAnsi="Calibri"/>
+                <w:sz w:val="20"/>
+              </w:rPr>
+              <w:t xml:space="default">0.96</w:t>
             </w:r>
           </w:p>
         </w:tc>
@@ -6767,7 +6767,7 @@
                 <w:rFonts w:ascii="Calibri" w:hAnsi="Calibri"/>
                 <w:sz w:val="20"/>
               </w:rPr>
-              <w:t xml:space="default">0.57</w:t>
+              <w:t xml:space="default">0.54</w:t>
             </w:r>
           </w:p>
         </w:tc>
@@ -6869,31 +6869,31 @@
                 <w:rFonts w:ascii="Calibri" w:hAnsi="Calibri"/>
                 <w:sz w:val="20"/>
               </w:rPr>
-              <w:t xml:space="default">-0.09 (-0.25 to 0.07)</w:t>
-            </w:r>
-          </w:p>
-        </w:tc>
-        <w:tc>
-          <w:tcPr>
-            <w:tcBorders>
-              <w:top w:val="single" w:space="0" w:color="D3D3D3"/>
-              <w:bottom w:val="single" w:space="0" w:color="D3D3D3"/>
-              <w:start w:val="single" w:space="0" w:color="D3D3D3"/>
-              <w:end w:val="single" w:space="0" w:color="D3D3D3"/>
-            </w:tcBorders>
-          </w:tcPr>
-          <w:p>
-            <w:pPr>
-              <w:spacing w:before="0" w:after="60"/>
-              <w:keepNext/>
-              <w:jc w:val="center"/>
-            </w:pPr>
-            <w:r>
-              <w:rPr>
-                <w:rFonts w:ascii="Calibri" w:hAnsi="Calibri"/>
-                <w:sz w:val="20"/>
-              </w:rPr>
-              <w:t xml:space="default">0.27</w:t>
+              <w:t xml:space="default">-0.10 (-0.26 to 0.07)</w:t>
+            </w:r>
+          </w:p>
+        </w:tc>
+        <w:tc>
+          <w:tcPr>
+            <w:tcBorders>
+              <w:top w:val="single" w:space="0" w:color="D3D3D3"/>
+              <w:bottom w:val="single" w:space="0" w:color="D3D3D3"/>
+              <w:start w:val="single" w:space="0" w:color="D3D3D3"/>
+              <w:end w:val="single" w:space="0" w:color="D3D3D3"/>
+            </w:tcBorders>
+          </w:tcPr>
+          <w:p>
+            <w:pPr>
+              <w:spacing w:before="0" w:after="60"/>
+              <w:keepNext/>
+              <w:jc w:val="center"/>
+            </w:pPr>
+            <w:r>
+              <w:rPr>
+                <w:rFonts w:ascii="Calibri" w:hAnsi="Calibri"/>
+                <w:sz w:val="20"/>
+              </w:rPr>
+              <w:t xml:space="default">0.25</w:t>
             </w:r>
           </w:p>
         </w:tc>
@@ -7019,7 +7019,7 @@
                 <w:sz w:val="20"/>
                 <w:b w:val="true"/>
               </w:rPr>
-              <w:t xml:space="default">0.047</w:t>
+              <w:t xml:space="default">0.040</w:t>
             </w:r>
           </w:p>
         </w:tc>
@@ -7144,7 +7144,7 @@
                 <w:rFonts w:ascii="Calibri" w:hAnsi="Calibri"/>
                 <w:sz w:val="20"/>
               </w:rPr>
-              <w:t xml:space="default">0.41</w:t>
+              <w:t xml:space="default">0.44</w:t>
             </w:r>
           </w:p>
         </w:tc>
@@ -7323,7 +7323,7 @@
                 <w:rFonts w:ascii="Calibri" w:hAnsi="Calibri"/>
                 <w:sz w:val="20"/>
               </w:rPr>
-              <w:t xml:space="default">0.08 (0.01 to 0.16)</w:t>
+              <w:t xml:space="default">0.08 (0.00 to 0.16)</w:t>
             </w:r>
           </w:p>
         </w:tc>
@@ -7348,55 +7348,55 @@
                 <w:sz w:val="20"/>
                 <w:b w:val="true"/>
               </w:rPr>
-              <w:t xml:space="default">0.035</w:t>
-            </w:r>
-          </w:p>
-        </w:tc>
-        <w:tc>
-          <w:tcPr>
-            <w:tcBorders>
-              <w:top w:val="single" w:space="0" w:color="D3D3D3"/>
-              <w:bottom w:val="single" w:space="0" w:color="D3D3D3"/>
-              <w:start w:val="single" w:space="0" w:color="D3D3D3"/>
-              <w:end w:val="single" w:space="0" w:color="D3D3D3"/>
-            </w:tcBorders>
-          </w:tcPr>
-          <w:p>
-            <w:pPr>
-              <w:spacing w:before="0" w:after="60"/>
-              <w:keepNext/>
-              <w:jc w:val="center"/>
-            </w:pPr>
-            <w:r>
-              <w:rPr>
-                <w:rFonts w:ascii="Calibri" w:hAnsi="Calibri"/>
-                <w:sz w:val="20"/>
-              </w:rPr>
-              <w:t xml:space="default">0.07 (-0.02 to 0.17)</w:t>
-            </w:r>
-          </w:p>
-        </w:tc>
-        <w:tc>
-          <w:tcPr>
-            <w:tcBorders>
-              <w:top w:val="single" w:space="0" w:color="D3D3D3"/>
-              <w:bottom w:val="single" w:space="0" w:color="D3D3D3"/>
-              <w:start w:val="single" w:space="0" w:color="D3D3D3"/>
-              <w:end w:val="single" w:space="0" w:color="D3D3D3"/>
-            </w:tcBorders>
-          </w:tcPr>
-          <w:p>
-            <w:pPr>
-              <w:spacing w:before="0" w:after="60"/>
-              <w:keepNext/>
-              <w:jc w:val="center"/>
-            </w:pPr>
-            <w:r>
-              <w:rPr>
-                <w:rFonts w:ascii="Calibri" w:hAnsi="Calibri"/>
-                <w:sz w:val="20"/>
-              </w:rPr>
-              <w:t xml:space="default">0.11</w:t>
+              <w:t xml:space="default">0.037</w:t>
+            </w:r>
+          </w:p>
+        </w:tc>
+        <w:tc>
+          <w:tcPr>
+            <w:tcBorders>
+              <w:top w:val="single" w:space="0" w:color="D3D3D3"/>
+              <w:bottom w:val="single" w:space="0" w:color="D3D3D3"/>
+              <w:start w:val="single" w:space="0" w:color="D3D3D3"/>
+              <w:end w:val="single" w:space="0" w:color="D3D3D3"/>
+            </w:tcBorders>
+          </w:tcPr>
+          <w:p>
+            <w:pPr>
+              <w:spacing w:before="0" w:after="60"/>
+              <w:keepNext/>
+              <w:jc w:val="center"/>
+            </w:pPr>
+            <w:r>
+              <w:rPr>
+                <w:rFonts w:ascii="Calibri" w:hAnsi="Calibri"/>
+                <w:sz w:val="20"/>
+              </w:rPr>
+              <w:t xml:space="default">0.07 (-0.02 to 0.16)</w:t>
+            </w:r>
+          </w:p>
+        </w:tc>
+        <w:tc>
+          <w:tcPr>
+            <w:tcBorders>
+              <w:top w:val="single" w:space="0" w:color="D3D3D3"/>
+              <w:bottom w:val="single" w:space="0" w:color="D3D3D3"/>
+              <w:start w:val="single" w:space="0" w:color="D3D3D3"/>
+              <w:end w:val="single" w:space="0" w:color="D3D3D3"/>
+            </w:tcBorders>
+          </w:tcPr>
+          <w:p>
+            <w:pPr>
+              <w:spacing w:before="0" w:after="60"/>
+              <w:keepNext/>
+              <w:jc w:val="center"/>
+            </w:pPr>
+            <w:r>
+              <w:rPr>
+                <w:rFonts w:ascii="Calibri" w:hAnsi="Calibri"/>
+                <w:sz w:val="20"/>
+              </w:rPr>
+              <w:t xml:space="default">0.12</w:t>
             </w:r>
           </w:p>
         </w:tc>
@@ -7449,79 +7449,79 @@
                 <w:rFonts w:ascii="Calibri" w:hAnsi="Calibri"/>
                 <w:sz w:val="20"/>
               </w:rPr>
-              <w:t xml:space="default">0.22 (-0.04 to 0.49)</w:t>
-            </w:r>
-          </w:p>
-        </w:tc>
-        <w:tc>
-          <w:tcPr>
-            <w:tcBorders>
-              <w:top w:val="single" w:space="0" w:color="D3D3D3"/>
-              <w:bottom w:val="single" w:space="0" w:color="D3D3D3"/>
-              <w:start w:val="single" w:space="0" w:color="D3D3D3"/>
-              <w:end w:val="single" w:space="0" w:color="D3D3D3"/>
-            </w:tcBorders>
-          </w:tcPr>
-          <w:p>
-            <w:pPr>
-              <w:spacing w:before="0" w:after="60"/>
-              <w:keepNext/>
-              <w:jc w:val="center"/>
-            </w:pPr>
-            <w:r>
-              <w:rPr>
-                <w:rFonts w:ascii="Calibri" w:hAnsi="Calibri"/>
-                <w:sz w:val="20"/>
-              </w:rPr>
-              <w:t xml:space="default">0.10</w:t>
-            </w:r>
-          </w:p>
-        </w:tc>
-        <w:tc>
-          <w:tcPr>
-            <w:tcBorders>
-              <w:top w:val="single" w:space="0" w:color="D3D3D3"/>
-              <w:bottom w:val="single" w:space="0" w:color="D3D3D3"/>
-              <w:start w:val="single" w:space="0" w:color="D3D3D3"/>
-              <w:end w:val="single" w:space="0" w:color="D3D3D3"/>
-            </w:tcBorders>
-          </w:tcPr>
-          <w:p>
-            <w:pPr>
-              <w:spacing w:before="0" w:after="60"/>
-              <w:keepNext/>
-              <w:jc w:val="center"/>
-            </w:pPr>
-            <w:r>
-              <w:rPr>
-                <w:rFonts w:ascii="Calibri" w:hAnsi="Calibri"/>
-                <w:sz w:val="20"/>
-              </w:rPr>
-              <w:t xml:space="default">0.18 (-0.22 to 0.57)</w:t>
-            </w:r>
-          </w:p>
-        </w:tc>
-        <w:tc>
-          <w:tcPr>
-            <w:tcBorders>
-              <w:top w:val="single" w:space="0" w:color="D3D3D3"/>
-              <w:bottom w:val="single" w:space="0" w:color="D3D3D3"/>
-              <w:start w:val="single" w:space="0" w:color="D3D3D3"/>
-              <w:end w:val="single" w:space="0" w:color="D3D3D3"/>
-            </w:tcBorders>
-          </w:tcPr>
-          <w:p>
-            <w:pPr>
-              <w:spacing w:before="0" w:after="60"/>
-              <w:keepNext/>
-              <w:jc w:val="center"/>
-            </w:pPr>
-            <w:r>
-              <w:rPr>
-                <w:rFonts w:ascii="Calibri" w:hAnsi="Calibri"/>
-                <w:sz w:val="20"/>
-              </w:rPr>
-              <w:t xml:space="default">0.38</w:t>
+              <w:t xml:space="default">0.22 (-0.05 to 0.49)</w:t>
+            </w:r>
+          </w:p>
+        </w:tc>
+        <w:tc>
+          <w:tcPr>
+            <w:tcBorders>
+              <w:top w:val="single" w:space="0" w:color="D3D3D3"/>
+              <w:bottom w:val="single" w:space="0" w:color="D3D3D3"/>
+              <w:start w:val="single" w:space="0" w:color="D3D3D3"/>
+              <w:end w:val="single" w:space="0" w:color="D3D3D3"/>
+            </w:tcBorders>
+          </w:tcPr>
+          <w:p>
+            <w:pPr>
+              <w:spacing w:before="0" w:after="60"/>
+              <w:keepNext/>
+              <w:jc w:val="center"/>
+            </w:pPr>
+            <w:r>
+              <w:rPr>
+                <w:rFonts w:ascii="Calibri" w:hAnsi="Calibri"/>
+                <w:sz w:val="20"/>
+              </w:rPr>
+              <w:t xml:space="default">0.11</w:t>
+            </w:r>
+          </w:p>
+        </w:tc>
+        <w:tc>
+          <w:tcPr>
+            <w:tcBorders>
+              <w:top w:val="single" w:space="0" w:color="D3D3D3"/>
+              <w:bottom w:val="single" w:space="0" w:color="D3D3D3"/>
+              <w:start w:val="single" w:space="0" w:color="D3D3D3"/>
+              <w:end w:val="single" w:space="0" w:color="D3D3D3"/>
+            </w:tcBorders>
+          </w:tcPr>
+          <w:p>
+            <w:pPr>
+              <w:spacing w:before="0" w:after="60"/>
+              <w:keepNext/>
+              <w:jc w:val="center"/>
+            </w:pPr>
+            <w:r>
+              <w:rPr>
+                <w:rFonts w:ascii="Calibri" w:hAnsi="Calibri"/>
+                <w:sz w:val="20"/>
+              </w:rPr>
+              <w:t xml:space="default">0.16 (-0.23 to 0.55)</w:t>
+            </w:r>
+          </w:p>
+        </w:tc>
+        <w:tc>
+          <w:tcPr>
+            <w:tcBorders>
+              <w:top w:val="single" w:space="0" w:color="D3D3D3"/>
+              <w:bottom w:val="single" w:space="0" w:color="D3D3D3"/>
+              <w:start w:val="single" w:space="0" w:color="D3D3D3"/>
+              <w:end w:val="single" w:space="0" w:color="D3D3D3"/>
+            </w:tcBorders>
+          </w:tcPr>
+          <w:p>
+            <w:pPr>
+              <w:spacing w:before="0" w:after="60"/>
+              <w:keepNext/>
+              <w:jc w:val="center"/>
+            </w:pPr>
+            <w:r>
+              <w:rPr>
+                <w:rFonts w:ascii="Calibri" w:hAnsi="Calibri"/>
+                <w:sz w:val="20"/>
+              </w:rPr>
+              <w:t xml:space="default">0.42</w:t>
             </w:r>
           </w:p>
         </w:tc>
@@ -7646,7 +7646,7 @@
                 <w:rFonts w:ascii="Calibri" w:hAnsi="Calibri"/>
                 <w:sz w:val="20"/>
               </w:rPr>
-              <w:t xml:space="default">0.98</w:t>
+              <w:t xml:space="default">&gt;0.99</w:t>
             </w:r>
           </w:p>
         </w:tc>
@@ -7771,7 +7771,7 @@
                 <w:rFonts w:ascii="Calibri" w:hAnsi="Calibri"/>
                 <w:sz w:val="20"/>
               </w:rPr>
-              <w:t xml:space="default">0.57</w:t>
+              <w:t xml:space="default">0.60</w:t>
             </w:r>
           </w:p>
         </w:tc>
@@ -8023,7 +8023,7 @@
                 <w:rFonts w:ascii="Calibri" w:hAnsi="Calibri"/>
                 <w:sz w:val="20"/>
               </w:rPr>
-              <w:t xml:space="default">0.12</w:t>
+              <w:t xml:space="default">0.13</w:t>
             </w:r>
           </w:p>
         </w:tc>
@@ -8076,79 +8076,79 @@
                 <w:rFonts w:ascii="Calibri" w:hAnsi="Calibri"/>
                 <w:sz w:val="20"/>
               </w:rPr>
-              <w:t xml:space="default">0.16 (-0.03 to 0.35)</w:t>
-            </w:r>
-          </w:p>
-        </w:tc>
-        <w:tc>
-          <w:tcPr>
-            <w:tcBorders>
-              <w:top w:val="single" w:space="0" w:color="D3D3D3"/>
-              <w:bottom w:val="single" w:space="0" w:color="D3D3D3"/>
-              <w:start w:val="single" w:space="0" w:color="D3D3D3"/>
-              <w:end w:val="single" w:space="0" w:color="D3D3D3"/>
-            </w:tcBorders>
-          </w:tcPr>
-          <w:p>
-            <w:pPr>
-              <w:spacing w:before="0" w:after="60"/>
-              <w:keepNext/>
-              <w:jc w:val="center"/>
-            </w:pPr>
-            <w:r>
-              <w:rPr>
-                <w:rFonts w:ascii="Calibri" w:hAnsi="Calibri"/>
-                <w:sz w:val="20"/>
-              </w:rPr>
-              <w:t xml:space="default">0.095</w:t>
-            </w:r>
-          </w:p>
-        </w:tc>
-        <w:tc>
-          <w:tcPr>
-            <w:tcBorders>
-              <w:top w:val="single" w:space="0" w:color="D3D3D3"/>
-              <w:bottom w:val="single" w:space="0" w:color="D3D3D3"/>
-              <w:start w:val="single" w:space="0" w:color="D3D3D3"/>
-              <w:end w:val="single" w:space="0" w:color="D3D3D3"/>
-            </w:tcBorders>
-          </w:tcPr>
-          <w:p>
-            <w:pPr>
-              <w:spacing w:before="0" w:after="60"/>
-              <w:keepNext/>
-              <w:jc w:val="center"/>
-            </w:pPr>
-            <w:r>
-              <w:rPr>
-                <w:rFonts w:ascii="Calibri" w:hAnsi="Calibri"/>
-                <w:sz w:val="20"/>
-              </w:rPr>
-              <w:t xml:space="default">0.10 (-0.18 to 0.38)</w:t>
-            </w:r>
-          </w:p>
-        </w:tc>
-        <w:tc>
-          <w:tcPr>
-            <w:tcBorders>
-              <w:top w:val="single" w:space="0" w:color="D3D3D3"/>
-              <w:bottom w:val="single" w:space="0" w:color="D3D3D3"/>
-              <w:start w:val="single" w:space="0" w:color="D3D3D3"/>
-              <w:end w:val="single" w:space="0" w:color="D3D3D3"/>
-            </w:tcBorders>
-          </w:tcPr>
-          <w:p>
-            <w:pPr>
-              <w:spacing w:before="0" w:after="60"/>
-              <w:keepNext/>
-              <w:jc w:val="center"/>
-            </w:pPr>
-            <w:r>
-              <w:rPr>
-                <w:rFonts w:ascii="Calibri" w:hAnsi="Calibri"/>
-                <w:sz w:val="20"/>
-              </w:rPr>
-              <w:t xml:space="default">0.48</w:t>
+              <w:t xml:space="default">0.16 (-0.03 to 0.36)</w:t>
+            </w:r>
+          </w:p>
+        </w:tc>
+        <w:tc>
+          <w:tcPr>
+            <w:tcBorders>
+              <w:top w:val="single" w:space="0" w:color="D3D3D3"/>
+              <w:bottom w:val="single" w:space="0" w:color="D3D3D3"/>
+              <w:start w:val="single" w:space="0" w:color="D3D3D3"/>
+              <w:end w:val="single" w:space="0" w:color="D3D3D3"/>
+            </w:tcBorders>
+          </w:tcPr>
+          <w:p>
+            <w:pPr>
+              <w:spacing w:before="0" w:after="60"/>
+              <w:keepNext/>
+              <w:jc w:val="center"/>
+            </w:pPr>
+            <w:r>
+              <w:rPr>
+                <w:rFonts w:ascii="Calibri" w:hAnsi="Calibri"/>
+                <w:sz w:val="20"/>
+              </w:rPr>
+              <w:t xml:space="default">0.091</w:t>
+            </w:r>
+          </w:p>
+        </w:tc>
+        <w:tc>
+          <w:tcPr>
+            <w:tcBorders>
+              <w:top w:val="single" w:space="0" w:color="D3D3D3"/>
+              <w:bottom w:val="single" w:space="0" w:color="D3D3D3"/>
+              <w:start w:val="single" w:space="0" w:color="D3D3D3"/>
+              <w:end w:val="single" w:space="0" w:color="D3D3D3"/>
+            </w:tcBorders>
+          </w:tcPr>
+          <w:p>
+            <w:pPr>
+              <w:spacing w:before="0" w:after="60"/>
+              <w:keepNext/>
+              <w:jc w:val="center"/>
+            </w:pPr>
+            <w:r>
+              <w:rPr>
+                <w:rFonts w:ascii="Calibri" w:hAnsi="Calibri"/>
+                <w:sz w:val="20"/>
+              </w:rPr>
+              <w:t xml:space="default">0.09 (-0.18 to 0.37)</w:t>
+            </w:r>
+          </w:p>
+        </w:tc>
+        <w:tc>
+          <w:tcPr>
+            <w:tcBorders>
+              <w:top w:val="single" w:space="0" w:color="D3D3D3"/>
+              <w:bottom w:val="single" w:space="0" w:color="D3D3D3"/>
+              <w:start w:val="single" w:space="0" w:color="D3D3D3"/>
+              <w:end w:val="single" w:space="0" w:color="D3D3D3"/>
+            </w:tcBorders>
+          </w:tcPr>
+          <w:p>
+            <w:pPr>
+              <w:spacing w:before="0" w:after="60"/>
+              <w:keepNext/>
+              <w:jc w:val="center"/>
+            </w:pPr>
+            <w:r>
+              <w:rPr>
+                <w:rFonts w:ascii="Calibri" w:hAnsi="Calibri"/>
+                <w:sz w:val="20"/>
+              </w:rPr>
+              <w:t xml:space="default">0.51</w:t>
             </w:r>
           </w:p>
         </w:tc>
@@ -8274,7 +8274,7 @@
                 <w:sz w:val="20"/>
                 <w:b w:val="true"/>
               </w:rPr>
-              <w:t xml:space="default">0.018</w:t>
+              <w:t xml:space="default">0.017</w:t>
             </w:r>
           </w:p>
         </w:tc>
@@ -8399,7 +8399,7 @@
                 <w:rFonts w:ascii="Calibri" w:hAnsi="Calibri"/>
                 <w:sz w:val="20"/>
               </w:rPr>
-              <w:t xml:space="default">0.70</w:t>
+              <w:t xml:space="default">0.68</w:t>
             </w:r>
           </w:p>
         </w:tc>
@@ -8578,31 +8578,31 @@
                 <w:rFonts w:ascii="Calibri" w:hAnsi="Calibri"/>
                 <w:sz w:val="20"/>
               </w:rPr>
-              <w:t xml:space="default">0.00 (-0.07 to 0.07)</w:t>
-            </w:r>
-          </w:p>
-        </w:tc>
-        <w:tc>
-          <w:tcPr>
-            <w:tcBorders>
-              <w:top w:val="single" w:space="0" w:color="D3D3D3"/>
-              <w:bottom w:val="single" w:space="0" w:color="D3D3D3"/>
-              <w:start w:val="single" w:space="0" w:color="D3D3D3"/>
-              <w:end w:val="single" w:space="0" w:color="D3D3D3"/>
-            </w:tcBorders>
-          </w:tcPr>
-          <w:p>
-            <w:pPr>
-              <w:spacing w:before="0" w:after="60"/>
-              <w:keepNext/>
-              <w:jc w:val="center"/>
-            </w:pPr>
-            <w:r>
-              <w:rPr>
-                <w:rFonts w:ascii="Calibri" w:hAnsi="Calibri"/>
-                <w:sz w:val="20"/>
-              </w:rPr>
-              <w:t xml:space="default">0.98</w:t>
+              <w:t xml:space="default">0.00 (-0.07 to 0.06)</w:t>
+            </w:r>
+          </w:p>
+        </w:tc>
+        <w:tc>
+          <w:tcPr>
+            <w:tcBorders>
+              <w:top w:val="single" w:space="0" w:color="D3D3D3"/>
+              <w:bottom w:val="single" w:space="0" w:color="D3D3D3"/>
+              <w:start w:val="single" w:space="0" w:color="D3D3D3"/>
+              <w:end w:val="single" w:space="0" w:color="D3D3D3"/>
+            </w:tcBorders>
+          </w:tcPr>
+          <w:p>
+            <w:pPr>
+              <w:spacing w:before="0" w:after="60"/>
+              <w:keepNext/>
+              <w:jc w:val="center"/>
+            </w:pPr>
+            <w:r>
+              <w:rPr>
+                <w:rFonts w:ascii="Calibri" w:hAnsi="Calibri"/>
+                <w:sz w:val="20"/>
+              </w:rPr>
+              <w:t xml:space="default">0.91</w:t>
             </w:r>
           </w:p>
         </w:tc>
@@ -8650,7 +8650,7 @@
                 <w:rFonts w:ascii="Calibri" w:hAnsi="Calibri"/>
                 <w:sz w:val="20"/>
               </w:rPr>
-              <w:t xml:space="default">0.62</w:t>
+              <w:t xml:space="default">0.58</w:t>
             </w:r>
           </w:p>
         </w:tc>
@@ -8703,79 +8703,79 @@
                 <w:rFonts w:ascii="Calibri" w:hAnsi="Calibri"/>
                 <w:sz w:val="20"/>
               </w:rPr>
-              <w:t xml:space="default">0.13 (-0.09 to 0.36)</w:t>
-            </w:r>
-          </w:p>
-        </w:tc>
-        <w:tc>
-          <w:tcPr>
-            <w:tcBorders>
-              <w:top w:val="single" w:space="0" w:color="D3D3D3"/>
-              <w:bottom w:val="single" w:space="0" w:color="D3D3D3"/>
-              <w:start w:val="single" w:space="0" w:color="D3D3D3"/>
-              <w:end w:val="single" w:space="0" w:color="D3D3D3"/>
-            </w:tcBorders>
-          </w:tcPr>
-          <w:p>
-            <w:pPr>
-              <w:spacing w:before="0" w:after="60"/>
-              <w:keepNext/>
-              <w:jc w:val="center"/>
-            </w:pPr>
-            <w:r>
-              <w:rPr>
-                <w:rFonts w:ascii="Calibri" w:hAnsi="Calibri"/>
-                <w:sz w:val="20"/>
-              </w:rPr>
-              <w:t xml:space="default">0.24</w:t>
-            </w:r>
-          </w:p>
-        </w:tc>
-        <w:tc>
-          <w:tcPr>
-            <w:tcBorders>
-              <w:top w:val="single" w:space="0" w:color="D3D3D3"/>
-              <w:bottom w:val="single" w:space="0" w:color="D3D3D3"/>
-              <w:start w:val="single" w:space="0" w:color="D3D3D3"/>
-              <w:end w:val="single" w:space="0" w:color="D3D3D3"/>
-            </w:tcBorders>
-          </w:tcPr>
-          <w:p>
-            <w:pPr>
-              <w:spacing w:before="0" w:after="60"/>
-              <w:keepNext/>
-              <w:jc w:val="center"/>
-            </w:pPr>
-            <w:r>
-              <w:rPr>
-                <w:rFonts w:ascii="Calibri" w:hAnsi="Calibri"/>
-                <w:sz w:val="20"/>
-              </w:rPr>
-              <w:t xml:space="default">0.20 (-0.15 to 0.54)</w:t>
-            </w:r>
-          </w:p>
-        </w:tc>
-        <w:tc>
-          <w:tcPr>
-            <w:tcBorders>
-              <w:top w:val="single" w:space="0" w:color="D3D3D3"/>
-              <w:bottom w:val="single" w:space="0" w:color="D3D3D3"/>
-              <w:start w:val="single" w:space="0" w:color="D3D3D3"/>
-              <w:end w:val="single" w:space="0" w:color="D3D3D3"/>
-            </w:tcBorders>
-          </w:tcPr>
-          <w:p>
-            <w:pPr>
-              <w:spacing w:before="0" w:after="60"/>
-              <w:keepNext/>
-              <w:jc w:val="center"/>
-            </w:pPr>
-            <w:r>
-              <w:rPr>
-                <w:rFonts w:ascii="Calibri" w:hAnsi="Calibri"/>
-                <w:sz w:val="20"/>
-              </w:rPr>
-              <w:t xml:space="default">0.27</w:t>
+              <w:t xml:space="default">0.12 (-0.10 to 0.35)</w:t>
+            </w:r>
+          </w:p>
+        </w:tc>
+        <w:tc>
+          <w:tcPr>
+            <w:tcBorders>
+              <w:top w:val="single" w:space="0" w:color="D3D3D3"/>
+              <w:bottom w:val="single" w:space="0" w:color="D3D3D3"/>
+              <w:start w:val="single" w:space="0" w:color="D3D3D3"/>
+              <w:end w:val="single" w:space="0" w:color="D3D3D3"/>
+            </w:tcBorders>
+          </w:tcPr>
+          <w:p>
+            <w:pPr>
+              <w:spacing w:before="0" w:after="60"/>
+              <w:keepNext/>
+              <w:jc w:val="center"/>
+            </w:pPr>
+            <w:r>
+              <w:rPr>
+                <w:rFonts w:ascii="Calibri" w:hAnsi="Calibri"/>
+                <w:sz w:val="20"/>
+              </w:rPr>
+              <w:t xml:space="default">0.28</w:t>
+            </w:r>
+          </w:p>
+        </w:tc>
+        <w:tc>
+          <w:tcPr>
+            <w:tcBorders>
+              <w:top w:val="single" w:space="0" w:color="D3D3D3"/>
+              <w:bottom w:val="single" w:space="0" w:color="D3D3D3"/>
+              <w:start w:val="single" w:space="0" w:color="D3D3D3"/>
+              <w:end w:val="single" w:space="0" w:color="D3D3D3"/>
+            </w:tcBorders>
+          </w:tcPr>
+          <w:p>
+            <w:pPr>
+              <w:spacing w:before="0" w:after="60"/>
+              <w:keepNext/>
+              <w:jc w:val="center"/>
+            </w:pPr>
+            <w:r>
+              <w:rPr>
+                <w:rFonts w:ascii="Calibri" w:hAnsi="Calibri"/>
+                <w:sz w:val="20"/>
+              </w:rPr>
+              <w:t xml:space="default">0.18 (-0.17 to 0.53)</w:t>
+            </w:r>
+          </w:p>
+        </w:tc>
+        <w:tc>
+          <w:tcPr>
+            <w:tcBorders>
+              <w:top w:val="single" w:space="0" w:color="D3D3D3"/>
+              <w:bottom w:val="single" w:space="0" w:color="D3D3D3"/>
+              <w:start w:val="single" w:space="0" w:color="D3D3D3"/>
+              <w:end w:val="single" w:space="0" w:color="D3D3D3"/>
+            </w:tcBorders>
+          </w:tcPr>
+          <w:p>
+            <w:pPr>
+              <w:spacing w:before="0" w:after="60"/>
+              <w:keepNext/>
+              <w:jc w:val="center"/>
+            </w:pPr>
+            <w:r>
+              <w:rPr>
+                <w:rFonts w:ascii="Calibri" w:hAnsi="Calibri"/>
+                <w:sz w:val="20"/>
+              </w:rPr>
+              <w:t xml:space="default">0.31</w:t>
             </w:r>
           </w:p>
         </w:tc>
@@ -9026,7 +9026,7 @@
                 <w:rFonts w:ascii="Calibri" w:hAnsi="Calibri"/>
                 <w:sz w:val="20"/>
               </w:rPr>
-              <w:t xml:space="default">0.40</w:t>
+              <w:t xml:space="default">0.36</w:t>
             </w:r>
           </w:p>
         </w:tc>
@@ -9205,79 +9205,79 @@
                 <w:rFonts w:ascii="Calibri" w:hAnsi="Calibri"/>
                 <w:sz w:val="20"/>
               </w:rPr>
-              <w:t xml:space="default">-0.05 (-0.13 to 0.04)</w:t>
-            </w:r>
-          </w:p>
-        </w:tc>
-        <w:tc>
-          <w:tcPr>
-            <w:tcBorders>
-              <w:top w:val="single" w:space="0" w:color="D3D3D3"/>
-              <w:bottom w:val="single" w:space="0" w:color="D3D3D3"/>
-              <w:start w:val="single" w:space="0" w:color="D3D3D3"/>
-              <w:end w:val="single" w:space="0" w:color="D3D3D3"/>
-            </w:tcBorders>
-          </w:tcPr>
-          <w:p>
-            <w:pPr>
-              <w:spacing w:before="0" w:after="60"/>
-              <w:keepNext/>
-              <w:jc w:val="center"/>
-            </w:pPr>
-            <w:r>
-              <w:rPr>
-                <w:rFonts w:ascii="Calibri" w:hAnsi="Calibri"/>
-                <w:sz w:val="20"/>
-              </w:rPr>
-              <w:t xml:space="default">0.29</w:t>
-            </w:r>
-          </w:p>
-        </w:tc>
-        <w:tc>
-          <w:tcPr>
-            <w:tcBorders>
-              <w:top w:val="single" w:space="0" w:color="D3D3D3"/>
-              <w:bottom w:val="single" w:space="0" w:color="D3D3D3"/>
-              <w:start w:val="single" w:space="0" w:color="D3D3D3"/>
-              <w:end w:val="single" w:space="0" w:color="D3D3D3"/>
-            </w:tcBorders>
-          </w:tcPr>
-          <w:p>
-            <w:pPr>
-              <w:spacing w:before="0" w:after="60"/>
-              <w:keepNext/>
-              <w:jc w:val="center"/>
-            </w:pPr>
-            <w:r>
-              <w:rPr>
-                <w:rFonts w:ascii="Calibri" w:hAnsi="Calibri"/>
-                <w:sz w:val="20"/>
-              </w:rPr>
-              <w:t xml:space="default">-0.03 (-0.14 to 0.07)</w:t>
-            </w:r>
-          </w:p>
-        </w:tc>
-        <w:tc>
-          <w:tcPr>
-            <w:tcBorders>
-              <w:top w:val="single" w:space="0" w:color="D3D3D3"/>
-              <w:bottom w:val="single" w:space="0" w:color="D3D3D3"/>
-              <w:start w:val="single" w:space="0" w:color="D3D3D3"/>
-              <w:end w:val="single" w:space="0" w:color="D3D3D3"/>
-            </w:tcBorders>
-          </w:tcPr>
-          <w:p>
-            <w:pPr>
-              <w:spacing w:before="0" w:after="60"/>
-              <w:keepNext/>
-              <w:jc w:val="center"/>
-            </w:pPr>
-            <w:r>
-              <w:rPr>
-                <w:rFonts w:ascii="Calibri" w:hAnsi="Calibri"/>
-                <w:sz w:val="20"/>
-              </w:rPr>
-              <w:t xml:space="default">0.52</w:t>
+              <w:t xml:space="default">-0.05 (-0.14 to 0.04)</w:t>
+            </w:r>
+          </w:p>
+        </w:tc>
+        <w:tc>
+          <w:tcPr>
+            <w:tcBorders>
+              <w:top w:val="single" w:space="0" w:color="D3D3D3"/>
+              <w:bottom w:val="single" w:space="0" w:color="D3D3D3"/>
+              <w:start w:val="single" w:space="0" w:color="D3D3D3"/>
+              <w:end w:val="single" w:space="0" w:color="D3D3D3"/>
+            </w:tcBorders>
+          </w:tcPr>
+          <w:p>
+            <w:pPr>
+              <w:spacing w:before="0" w:after="60"/>
+              <w:keepNext/>
+              <w:jc w:val="center"/>
+            </w:pPr>
+            <w:r>
+              <w:rPr>
+                <w:rFonts w:ascii="Calibri" w:hAnsi="Calibri"/>
+                <w:sz w:val="20"/>
+              </w:rPr>
+              <w:t xml:space="default">0.28</w:t>
+            </w:r>
+          </w:p>
+        </w:tc>
+        <w:tc>
+          <w:tcPr>
+            <w:tcBorders>
+              <w:top w:val="single" w:space="0" w:color="D3D3D3"/>
+              <w:bottom w:val="single" w:space="0" w:color="D3D3D3"/>
+              <w:start w:val="single" w:space="0" w:color="D3D3D3"/>
+              <w:end w:val="single" w:space="0" w:color="D3D3D3"/>
+            </w:tcBorders>
+          </w:tcPr>
+          <w:p>
+            <w:pPr>
+              <w:spacing w:before="0" w:after="60"/>
+              <w:keepNext/>
+              <w:jc w:val="center"/>
+            </w:pPr>
+            <w:r>
+              <w:rPr>
+                <w:rFonts w:ascii="Calibri" w:hAnsi="Calibri"/>
+                <w:sz w:val="20"/>
+              </w:rPr>
+              <w:t xml:space="default">-0.04 (-0.14 to 0.07)</w:t>
+            </w:r>
+          </w:p>
+        </w:tc>
+        <w:tc>
+          <w:tcPr>
+            <w:tcBorders>
+              <w:top w:val="single" w:space="0" w:color="D3D3D3"/>
+              <w:bottom w:val="single" w:space="0" w:color="D3D3D3"/>
+              <w:start w:val="single" w:space="0" w:color="D3D3D3"/>
+              <w:end w:val="single" w:space="0" w:color="D3D3D3"/>
+            </w:tcBorders>
+          </w:tcPr>
+          <w:p>
+            <w:pPr>
+              <w:spacing w:before="0" w:after="60"/>
+              <w:keepNext/>
+              <w:jc w:val="center"/>
+            </w:pPr>
+            <w:r>
+              <w:rPr>
+                <w:rFonts w:ascii="Calibri" w:hAnsi="Calibri"/>
+                <w:sz w:val="20"/>
+              </w:rPr>
+              <w:t xml:space="default">0.51</w:t>
             </w:r>
           </w:p>
         </w:tc>
@@ -9330,79 +9330,79 @@
                 <w:rFonts w:ascii="Calibri" w:hAnsi="Calibri"/>
                 <w:sz w:val="20"/>
               </w:rPr>
-              <w:t xml:space="default">-0.12 (-0.41 to 0.16)</w:t>
-            </w:r>
-          </w:p>
-        </w:tc>
-        <w:tc>
-          <w:tcPr>
-            <w:tcBorders>
-              <w:top w:val="single" w:space="0" w:color="D3D3D3"/>
-              <w:bottom w:val="single" w:space="0" w:color="D3D3D3"/>
-              <w:start w:val="single" w:space="0" w:color="D3D3D3"/>
-              <w:end w:val="single" w:space="0" w:color="D3D3D3"/>
-            </w:tcBorders>
-          </w:tcPr>
-          <w:p>
-            <w:pPr>
-              <w:spacing w:before="0" w:after="60"/>
-              <w:keepNext/>
-              <w:jc w:val="center"/>
-            </w:pPr>
-            <w:r>
-              <w:rPr>
-                <w:rFonts w:ascii="Calibri" w:hAnsi="Calibri"/>
-                <w:sz w:val="20"/>
-              </w:rPr>
-              <w:t xml:space="default">0.40</w:t>
-            </w:r>
-          </w:p>
-        </w:tc>
-        <w:tc>
-          <w:tcPr>
-            <w:tcBorders>
-              <w:top w:val="single" w:space="0" w:color="D3D3D3"/>
-              <w:bottom w:val="single" w:space="0" w:color="D3D3D3"/>
-              <w:start w:val="single" w:space="0" w:color="D3D3D3"/>
-              <w:end w:val="single" w:space="0" w:color="D3D3D3"/>
-            </w:tcBorders>
-          </w:tcPr>
-          <w:p>
-            <w:pPr>
-              <w:spacing w:before="0" w:after="60"/>
-              <w:keepNext/>
-              <w:jc w:val="center"/>
-            </w:pPr>
-            <w:r>
-              <w:rPr>
-                <w:rFonts w:ascii="Calibri" w:hAnsi="Calibri"/>
-                <w:sz w:val="20"/>
-              </w:rPr>
-              <w:t xml:space="default">-0.16 (-0.61 to 0.29)</w:t>
-            </w:r>
-          </w:p>
-        </w:tc>
-        <w:tc>
-          <w:tcPr>
-            <w:tcBorders>
-              <w:top w:val="single" w:space="0" w:color="D3D3D3"/>
-              <w:bottom w:val="single" w:space="0" w:color="D3D3D3"/>
-              <w:start w:val="single" w:space="0" w:color="D3D3D3"/>
-              <w:end w:val="single" w:space="0" w:color="D3D3D3"/>
-            </w:tcBorders>
-          </w:tcPr>
-          <w:p>
-            <w:pPr>
-              <w:spacing w:before="0" w:after="60"/>
-              <w:keepNext/>
-              <w:jc w:val="center"/>
-            </w:pPr>
-            <w:r>
-              <w:rPr>
-                <w:rFonts w:ascii="Calibri" w:hAnsi="Calibri"/>
-                <w:sz w:val="20"/>
-              </w:rPr>
-              <w:t xml:space="default">0.49</w:t>
+              <w:t xml:space="default">-0.12 (-0.41 to 0.17)</w:t>
+            </w:r>
+          </w:p>
+        </w:tc>
+        <w:tc>
+          <w:tcPr>
+            <w:tcBorders>
+              <w:top w:val="single" w:space="0" w:color="D3D3D3"/>
+              <w:bottom w:val="single" w:space="0" w:color="D3D3D3"/>
+              <w:start w:val="single" w:space="0" w:color="D3D3D3"/>
+              <w:end w:val="single" w:space="0" w:color="D3D3D3"/>
+            </w:tcBorders>
+          </w:tcPr>
+          <w:p>
+            <w:pPr>
+              <w:spacing w:before="0" w:after="60"/>
+              <w:keepNext/>
+              <w:jc w:val="center"/>
+            </w:pPr>
+            <w:r>
+              <w:rPr>
+                <w:rFonts w:ascii="Calibri" w:hAnsi="Calibri"/>
+                <w:sz w:val="20"/>
+              </w:rPr>
+              <w:t xml:space="default">0.41</w:t>
+            </w:r>
+          </w:p>
+        </w:tc>
+        <w:tc>
+          <w:tcPr>
+            <w:tcBorders>
+              <w:top w:val="single" w:space="0" w:color="D3D3D3"/>
+              <w:bottom w:val="single" w:space="0" w:color="D3D3D3"/>
+              <w:start w:val="single" w:space="0" w:color="D3D3D3"/>
+              <w:end w:val="single" w:space="0" w:color="D3D3D3"/>
+            </w:tcBorders>
+          </w:tcPr>
+          <w:p>
+            <w:pPr>
+              <w:spacing w:before="0" w:after="60"/>
+              <w:keepNext/>
+              <w:jc w:val="center"/>
+            </w:pPr>
+            <w:r>
+              <w:rPr>
+                <w:rFonts w:ascii="Calibri" w:hAnsi="Calibri"/>
+                <w:sz w:val="20"/>
+              </w:rPr>
+              <w:t xml:space="default">-0.15 (-0.61 to 0.30)</w:t>
+            </w:r>
+          </w:p>
+        </w:tc>
+        <w:tc>
+          <w:tcPr>
+            <w:tcBorders>
+              <w:top w:val="single" w:space="0" w:color="D3D3D3"/>
+              <w:bottom w:val="single" w:space="0" w:color="D3D3D3"/>
+              <w:start w:val="single" w:space="0" w:color="D3D3D3"/>
+              <w:end w:val="single" w:space="0" w:color="D3D3D3"/>
+            </w:tcBorders>
+          </w:tcPr>
+          <w:p>
+            <w:pPr>
+              <w:spacing w:before="0" w:after="60"/>
+              <w:keepNext/>
+              <w:jc w:val="center"/>
+            </w:pPr>
+            <w:r>
+              <w:rPr>
+                <w:rFonts w:ascii="Calibri" w:hAnsi="Calibri"/>
+                <w:sz w:val="20"/>
+              </w:rPr>
+              <w:t xml:space="default">0.51</w:t>
             </w:r>
           </w:p>
         </w:tc>
@@ -9628,31 +9628,31 @@
                 <w:rFonts w:ascii="Calibri" w:hAnsi="Calibri"/>
                 <w:sz w:val="20"/>
               </w:rPr>
-              <w:t xml:space="default">0.01 (-0.05 to 0.07)</w:t>
-            </w:r>
-          </w:p>
-        </w:tc>
-        <w:tc>
-          <w:tcPr>
-            <w:tcBorders>
-              <w:top w:val="single" w:space="0" w:color="D3D3D3"/>
-              <w:bottom w:val="single" w:space="0" w:color="D3D3D3"/>
-              <w:start w:val="single" w:space="0" w:color="D3D3D3"/>
-              <w:end w:val="single" w:space="0" w:color="D3D3D3"/>
-            </w:tcBorders>
-          </w:tcPr>
-          <w:p>
-            <w:pPr>
-              <w:spacing w:before="0" w:after="60"/>
-              <w:keepNext/>
-              <w:jc w:val="center"/>
-            </w:pPr>
-            <w:r>
-              <w:rPr>
-                <w:rFonts w:ascii="Calibri" w:hAnsi="Calibri"/>
-                <w:sz w:val="20"/>
-              </w:rPr>
-              <w:t xml:space="default">0.77</w:t>
+              <w:t xml:space="default">0.01 (-0.06 to 0.07)</w:t>
+            </w:r>
+          </w:p>
+        </w:tc>
+        <w:tc>
+          <w:tcPr>
+            <w:tcBorders>
+              <w:top w:val="single" w:space="0" w:color="D3D3D3"/>
+              <w:bottom w:val="single" w:space="0" w:color="D3D3D3"/>
+              <w:start w:val="single" w:space="0" w:color="D3D3D3"/>
+              <w:end w:val="single" w:space="0" w:color="D3D3D3"/>
+            </w:tcBorders>
+          </w:tcPr>
+          <w:p>
+            <w:pPr>
+              <w:spacing w:before="0" w:after="60"/>
+              <w:keepNext/>
+              <w:jc w:val="center"/>
+            </w:pPr>
+            <w:r>
+              <w:rPr>
+                <w:rFonts w:ascii="Calibri" w:hAnsi="Calibri"/>
+                <w:sz w:val="20"/>
+              </w:rPr>
+              <w:t xml:space="default">0.80</w:t>
             </w:r>
           </w:p>
         </w:tc>
@@ -10004,7 +10004,7 @@
                 <w:rFonts w:ascii="Calibri" w:hAnsi="Calibri"/>
                 <w:sz w:val="20"/>
               </w:rPr>
-              <w:t xml:space="default">-0.06 (-0.25 to 0.12)</w:t>
+              <w:t xml:space="default">-0.07 (-0.25 to 0.12)</w:t>
             </w:r>
           </w:p>
         </w:tc>
@@ -10279,7 +10279,7 @@
                 <w:rFonts w:ascii="Calibri" w:hAnsi="Calibri"/>
                 <w:sz w:val="20"/>
               </w:rPr>
-              <w:t xml:space="default">0.56</w:t>
+              <w:t xml:space="default">0.57</w:t>
             </w:r>
           </w:p>
         </w:tc>
@@ -10482,7 +10482,7 @@
                 <w:rFonts w:ascii="Calibri" w:hAnsi="Calibri"/>
                 <w:sz w:val="20"/>
               </w:rPr>
-              <w:t xml:space="default">0.35</w:t>
+              <w:t xml:space="default">0.32</w:t>
             </w:r>
           </w:p>
         </w:tc>
@@ -10530,7 +10530,7 @@
                 <w:rFonts w:ascii="Calibri" w:hAnsi="Calibri"/>
                 <w:sz w:val="20"/>
               </w:rPr>
-              <w:t xml:space="default">0.32</w:t>
+              <w:t xml:space="default">0.30</w:t>
             </w:r>
           </w:p>
         </w:tc>
@@ -10583,7 +10583,7 @@
                 <w:rFonts w:ascii="Calibri" w:hAnsi="Calibri"/>
                 <w:sz w:val="20"/>
               </w:rPr>
-              <w:t xml:space="default">-0.03 (-0.14 to 0.09)</w:t>
+              <w:t xml:space="default">-0.03 (-0.15 to 0.09)</w:t>
             </w:r>
           </w:p>
         </w:tc>
@@ -10631,31 +10631,31 @@
                 <w:rFonts w:ascii="Calibri" w:hAnsi="Calibri"/>
                 <w:sz w:val="20"/>
               </w:rPr>
-              <w:t xml:space="default">-0.04 (-0.22 to 0.13)</w:t>
-            </w:r>
-          </w:p>
-        </w:tc>
-        <w:tc>
-          <w:tcPr>
-            <w:tcBorders>
-              <w:top w:val="single" w:space="0" w:color="D3D3D3"/>
-              <w:bottom w:val="single" w:space="0" w:color="D3D3D3"/>
-              <w:start w:val="single" w:space="0" w:color="D3D3D3"/>
-              <w:end w:val="single" w:space="0" w:color="D3D3D3"/>
-            </w:tcBorders>
-          </w:tcPr>
-          <w:p>
-            <w:pPr>
-              <w:spacing w:before="0" w:after="60"/>
-              <w:keepNext/>
-              <w:jc w:val="center"/>
-            </w:pPr>
-            <w:r>
-              <w:rPr>
-                <w:rFonts w:ascii="Calibri" w:hAnsi="Calibri"/>
-                <w:sz w:val="20"/>
-              </w:rPr>
-              <w:t xml:space="default">0.62</w:t>
+              <w:t xml:space="default">-0.04 (-0.22 to 0.14)</w:t>
+            </w:r>
+          </w:p>
+        </w:tc>
+        <w:tc>
+          <w:tcPr>
+            <w:tcBorders>
+              <w:top w:val="single" w:space="0" w:color="D3D3D3"/>
+              <w:bottom w:val="single" w:space="0" w:color="D3D3D3"/>
+              <w:start w:val="single" w:space="0" w:color="D3D3D3"/>
+              <w:end w:val="single" w:space="0" w:color="D3D3D3"/>
+            </w:tcBorders>
+          </w:tcPr>
+          <w:p>
+            <w:pPr>
+              <w:spacing w:before="0" w:after="60"/>
+              <w:keepNext/>
+              <w:jc w:val="center"/>
+            </w:pPr>
+            <w:r>
+              <w:rPr>
+                <w:rFonts w:ascii="Calibri" w:hAnsi="Calibri"/>
+                <w:sz w:val="20"/>
+              </w:rPr>
+              <w:t xml:space="default">0.65</w:t>
             </w:r>
           </w:p>
         </w:tc>
@@ -10882,31 +10882,31 @@
                 <w:rFonts w:ascii="Calibri" w:hAnsi="Calibri"/>
                 <w:sz w:val="20"/>
               </w:rPr>
-              <w:t xml:space="default">0.01 (-0.01 to 0.04)</w:t>
-            </w:r>
-          </w:p>
-        </w:tc>
-        <w:tc>
-          <w:tcPr>
-            <w:tcBorders>
-              <w:top w:val="single" w:space="0" w:color="D3D3D3"/>
-              <w:bottom w:val="single" w:space="0" w:color="D3D3D3"/>
-              <w:start w:val="single" w:space="0" w:color="D3D3D3"/>
-              <w:end w:val="single" w:space="0" w:color="D3D3D3"/>
-            </w:tcBorders>
-          </w:tcPr>
-          <w:p>
-            <w:pPr>
-              <w:spacing w:before="0" w:after="60"/>
-              <w:keepNext/>
-              <w:jc w:val="center"/>
-            </w:pPr>
-            <w:r>
-              <w:rPr>
-                <w:rFonts w:ascii="Calibri" w:hAnsi="Calibri"/>
-                <w:sz w:val="20"/>
-              </w:rPr>
-              <w:t xml:space="default">0.39</w:t>
+              <w:t xml:space="default">0.01 (-0.02 to 0.04)</w:t>
+            </w:r>
+          </w:p>
+        </w:tc>
+        <w:tc>
+          <w:tcPr>
+            <w:tcBorders>
+              <w:top w:val="single" w:space="0" w:color="D3D3D3"/>
+              <w:bottom w:val="single" w:space="0" w:color="D3D3D3"/>
+              <w:start w:val="single" w:space="0" w:color="D3D3D3"/>
+              <w:end w:val="single" w:space="0" w:color="D3D3D3"/>
+            </w:tcBorders>
+          </w:tcPr>
+          <w:p>
+            <w:pPr>
+              <w:spacing w:before="0" w:after="60"/>
+              <w:keepNext/>
+              <w:jc w:val="center"/>
+            </w:pPr>
+            <w:r>
+              <w:rPr>
+                <w:rFonts w:ascii="Calibri" w:hAnsi="Calibri"/>
+                <w:sz w:val="20"/>
+              </w:rPr>
+              <w:t xml:space="default">0.44</w:t>
             </w:r>
           </w:p>
         </w:tc>
@@ -11109,55 +11109,55 @@
                 <w:rFonts w:ascii="Calibri" w:hAnsi="Calibri"/>
                 <w:sz w:val="20"/>
               </w:rPr>
-              <w:t xml:space="default">0.13</w:t>
-            </w:r>
-          </w:p>
-        </w:tc>
-        <w:tc>
-          <w:tcPr>
-            <w:tcBorders>
-              <w:top w:val="single" w:space="0" w:color="D3D3D3"/>
-              <w:bottom w:val="single" w:space="0" w:color="D3D3D3"/>
-              <w:start w:val="single" w:space="0" w:color="D3D3D3"/>
-              <w:end w:val="single" w:space="0" w:color="D3D3D3"/>
-            </w:tcBorders>
-          </w:tcPr>
-          <w:p>
-            <w:pPr>
-              <w:spacing w:before="0" w:after="60"/>
-              <w:keepNext/>
-              <w:jc w:val="center"/>
-            </w:pPr>
-            <w:r>
-              <w:rPr>
-                <w:rFonts w:ascii="Calibri" w:hAnsi="Calibri"/>
-                <w:sz w:val="20"/>
-              </w:rPr>
-              <w:t xml:space="default">-0.03 (-0.11 to 0.05)</w:t>
-            </w:r>
-          </w:p>
-        </w:tc>
-        <w:tc>
-          <w:tcPr>
-            <w:tcBorders>
-              <w:top w:val="single" w:space="0" w:color="D3D3D3"/>
-              <w:bottom w:val="single" w:space="0" w:color="D3D3D3"/>
-              <w:start w:val="single" w:space="0" w:color="D3D3D3"/>
-              <w:end w:val="single" w:space="0" w:color="D3D3D3"/>
-            </w:tcBorders>
-          </w:tcPr>
-          <w:p>
-            <w:pPr>
-              <w:spacing w:before="0" w:after="60"/>
-              <w:keepNext/>
-              <w:jc w:val="center"/>
-            </w:pPr>
-            <w:r>
-              <w:rPr>
-                <w:rFonts w:ascii="Calibri" w:hAnsi="Calibri"/>
-                <w:sz w:val="20"/>
-              </w:rPr>
-              <w:t xml:space="default">0.43</w:t>
+              <w:t xml:space="default">0.11</w:t>
+            </w:r>
+          </w:p>
+        </w:tc>
+        <w:tc>
+          <w:tcPr>
+            <w:tcBorders>
+              <w:top w:val="single" w:space="0" w:color="D3D3D3"/>
+              <w:bottom w:val="single" w:space="0" w:color="D3D3D3"/>
+              <w:start w:val="single" w:space="0" w:color="D3D3D3"/>
+              <w:end w:val="single" w:space="0" w:color="D3D3D3"/>
+            </w:tcBorders>
+          </w:tcPr>
+          <w:p>
+            <w:pPr>
+              <w:spacing w:before="0" w:after="60"/>
+              <w:keepNext/>
+              <w:jc w:val="center"/>
+            </w:pPr>
+            <w:r>
+              <w:rPr>
+                <w:rFonts w:ascii="Calibri" w:hAnsi="Calibri"/>
+                <w:sz w:val="20"/>
+              </w:rPr>
+              <w:t xml:space="default">-0.03 (-0.11 to 0.04)</w:t>
+            </w:r>
+          </w:p>
+        </w:tc>
+        <w:tc>
+          <w:tcPr>
+            <w:tcBorders>
+              <w:top w:val="single" w:space="0" w:color="D3D3D3"/>
+              <w:bottom w:val="single" w:space="0" w:color="D3D3D3"/>
+              <w:start w:val="single" w:space="0" w:color="D3D3D3"/>
+              <w:end w:val="single" w:space="0" w:color="D3D3D3"/>
+            </w:tcBorders>
+          </w:tcPr>
+          <w:p>
+            <w:pPr>
+              <w:spacing w:before="0" w:after="60"/>
+              <w:keepNext/>
+              <w:jc w:val="center"/>
+            </w:pPr>
+            <w:r>
+              <w:rPr>
+                <w:rFonts w:ascii="Calibri" w:hAnsi="Calibri"/>
+                <w:sz w:val="20"/>
+              </w:rPr>
+              <w:t xml:space="default">0.41</w:t>
             </w:r>
           </w:p>
         </w:tc>
@@ -11210,79 +11210,79 @@
                 <w:rFonts w:ascii="Calibri" w:hAnsi="Calibri"/>
                 <w:sz w:val="20"/>
               </w:rPr>
-              <w:t xml:space="default">-0.01 (-0.21 to 0.19)</w:t>
-            </w:r>
-          </w:p>
-        </w:tc>
-        <w:tc>
-          <w:tcPr>
-            <w:tcBorders>
-              <w:top w:val="single" w:space="0" w:color="D3D3D3"/>
-              <w:bottom w:val="single" w:space="0" w:color="D3D3D3"/>
-              <w:start w:val="single" w:space="0" w:color="D3D3D3"/>
-              <w:end w:val="single" w:space="0" w:color="D3D3D3"/>
-            </w:tcBorders>
-          </w:tcPr>
-          <w:p>
-            <w:pPr>
-              <w:spacing w:before="0" w:after="60"/>
-              <w:keepNext/>
-              <w:jc w:val="center"/>
-            </w:pPr>
-            <w:r>
-              <w:rPr>
-                <w:rFonts w:ascii="Calibri" w:hAnsi="Calibri"/>
-                <w:sz w:val="20"/>
-              </w:rPr>
-              <w:t xml:space="default">0.92</w:t>
-            </w:r>
-          </w:p>
-        </w:tc>
-        <w:tc>
-          <w:tcPr>
-            <w:tcBorders>
-              <w:top w:val="single" w:space="0" w:color="D3D3D3"/>
-              <w:bottom w:val="single" w:space="0" w:color="D3D3D3"/>
-              <w:start w:val="single" w:space="0" w:color="D3D3D3"/>
-              <w:end w:val="single" w:space="0" w:color="D3D3D3"/>
-            </w:tcBorders>
-          </w:tcPr>
-          <w:p>
-            <w:pPr>
-              <w:spacing w:before="0" w:after="60"/>
-              <w:keepNext/>
-              <w:jc w:val="center"/>
-            </w:pPr>
-            <w:r>
-              <w:rPr>
-                <w:rFonts w:ascii="Calibri" w:hAnsi="Calibri"/>
-                <w:sz w:val="20"/>
-              </w:rPr>
-              <w:t xml:space="default">0.11 (-0.21 to 0.43)</w:t>
-            </w:r>
-          </w:p>
-        </w:tc>
-        <w:tc>
-          <w:tcPr>
-            <w:tcBorders>
-              <w:top w:val="single" w:space="0" w:color="D3D3D3"/>
-              <w:bottom w:val="single" w:space="0" w:color="D3D3D3"/>
-              <w:start w:val="single" w:space="0" w:color="D3D3D3"/>
-              <w:end w:val="single" w:space="0" w:color="D3D3D3"/>
-            </w:tcBorders>
-          </w:tcPr>
-          <w:p>
-            <w:pPr>
-              <w:spacing w:before="0" w:after="60"/>
-              <w:keepNext/>
-              <w:jc w:val="center"/>
-            </w:pPr>
-            <w:r>
-              <w:rPr>
-                <w:rFonts w:ascii="Calibri" w:hAnsi="Calibri"/>
-                <w:sz w:val="20"/>
-              </w:rPr>
-              <w:t xml:space="default">0.50</w:t>
+              <w:t xml:space="default">-0.02 (-0.22 to 0.18)</w:t>
+            </w:r>
+          </w:p>
+        </w:tc>
+        <w:tc>
+          <w:tcPr>
+            <w:tcBorders>
+              <w:top w:val="single" w:space="0" w:color="D3D3D3"/>
+              <w:bottom w:val="single" w:space="0" w:color="D3D3D3"/>
+              <w:start w:val="single" w:space="0" w:color="D3D3D3"/>
+              <w:end w:val="single" w:space="0" w:color="D3D3D3"/>
+            </w:tcBorders>
+          </w:tcPr>
+          <w:p>
+            <w:pPr>
+              <w:spacing w:before="0" w:after="60"/>
+              <w:keepNext/>
+              <w:jc w:val="center"/>
+            </w:pPr>
+            <w:r>
+              <w:rPr>
+                <w:rFonts w:ascii="Calibri" w:hAnsi="Calibri"/>
+                <w:sz w:val="20"/>
+              </w:rPr>
+              <w:t xml:space="default">0.85</w:t>
+            </w:r>
+          </w:p>
+        </w:tc>
+        <w:tc>
+          <w:tcPr>
+            <w:tcBorders>
+              <w:top w:val="single" w:space="0" w:color="D3D3D3"/>
+              <w:bottom w:val="single" w:space="0" w:color="D3D3D3"/>
+              <w:start w:val="single" w:space="0" w:color="D3D3D3"/>
+              <w:end w:val="single" w:space="0" w:color="D3D3D3"/>
+            </w:tcBorders>
+          </w:tcPr>
+          <w:p>
+            <w:pPr>
+              <w:spacing w:before="0" w:after="60"/>
+              <w:keepNext/>
+              <w:jc w:val="center"/>
+            </w:pPr>
+            <w:r>
+              <w:rPr>
+                <w:rFonts w:ascii="Calibri" w:hAnsi="Calibri"/>
+                <w:sz w:val="20"/>
+              </w:rPr>
+              <w:t xml:space="default">0.11 (-0.22 to 0.43)</w:t>
+            </w:r>
+          </w:p>
+        </w:tc>
+        <w:tc>
+          <w:tcPr>
+            <w:tcBorders>
+              <w:top w:val="single" w:space="0" w:color="D3D3D3"/>
+              <w:bottom w:val="single" w:space="0" w:color="D3D3D3"/>
+              <w:start w:val="single" w:space="0" w:color="D3D3D3"/>
+              <w:end w:val="single" w:space="0" w:color="D3D3D3"/>
+            </w:tcBorders>
+          </w:tcPr>
+          <w:p>
+            <w:pPr>
+              <w:spacing w:before="0" w:after="60"/>
+              <w:keepNext/>
+              <w:jc w:val="center"/>
+            </w:pPr>
+            <w:r>
+              <w:rPr>
+                <w:rFonts w:ascii="Calibri" w:hAnsi="Calibri"/>
+                <w:sz w:val="20"/>
+              </w:rPr>
+              <w:t xml:space="default">0.52</w:t>
             </w:r>
           </w:p>
         </w:tc>
@@ -11532,7 +11532,7 @@
                 <w:rFonts w:ascii="Calibri" w:hAnsi="Calibri"/>
                 <w:sz w:val="20"/>
               </w:rPr>
-              <w:t xml:space="default">0.75</w:t>
+              <w:t xml:space="default">0.78</w:t>
             </w:r>
           </w:p>
         </w:tc>

</xml_diff>